<commit_message>
Update 周三 2026/08/26 18:59:12
</commit_message>
<xml_diff>
--- a/模板库/ku/上汽.docx
+++ b/模板库/ku/上汽.docx
@@ -409,8 +409,6 @@
           <w:lang w:val="en-US" w:eastAsia="zh-CN"/>
         </w:rPr>
       </w:pPr>
-      <w:bookmarkStart w:id="0" w:name="_GoBack"/>
-      <w:bookmarkEnd w:id="0"/>
     </w:p>
     <w:p>
       <w:pPr>
@@ -481,6 +479,3253 @@
         <w:t>功能状态E 在测试过程中和测试结束后，被测样件的一项或多项功能不能按照设计规范要求运行，在测试结束后，被测样件必须进行维修或更换。</w:t>
       </w:r>
     </w:p>
+    <w:p>
+      <w:pPr>
+        <w:numPr>
+          <w:ilvl w:val="0"/>
+          <w:numId w:val="0"/>
+        </w:numPr>
+        <w:ind w:leftChars="0"/>
+        <w:jc w:val="center"/>
+        <w:outlineLvl w:val="0"/>
+        <w:rPr>
+          <w:rFonts w:hint="eastAsia" w:ascii="宋体" w:hAnsi="宋体" w:eastAsia="宋体" w:cs="宋体"/>
+          <w:b/>
+          <w:sz w:val="32"/>
+          <w:szCs w:val="32"/>
+        </w:rPr>
+      </w:pPr>
+      <w:r>
+        <w:rPr>
+          <w:rFonts w:hint="eastAsia" w:ascii="宋体" w:hAnsi="宋体" w:cs="宋体"/>
+          <w:b/>
+          <w:sz w:val="32"/>
+          <w:szCs w:val="32"/>
+          <w:lang w:val="en-US" w:eastAsia="zh-CN"/>
+        </w:rPr>
+        <w:br w:type="page"/>
+      </w:r>
+      <w:bookmarkStart w:id="0" w:name="_Toc6559"/>
+      <w:bookmarkStart w:id="1" w:name="_Toc31863"/>
+      <w:bookmarkStart w:id="2" w:name="_Toc4889"/>
+      <w:bookmarkStart w:id="3" w:name="_Toc21708"/>
+      <w:bookmarkStart w:id="4" w:name="_Toc2329"/>
+      <w:r>
+        <w:rPr>
+          <w:rFonts w:hint="eastAsia" w:ascii="宋体" w:hAnsi="宋体" w:eastAsia="宋体" w:cs="宋体"/>
+          <w:b/>
+          <w:sz w:val="32"/>
+          <w:szCs w:val="32"/>
+        </w:rPr>
+        <w:t>试验结果汇总</w:t>
+      </w:r>
+      <w:bookmarkEnd w:id="0"/>
+      <w:bookmarkEnd w:id="1"/>
+      <w:bookmarkEnd w:id="2"/>
+      <w:bookmarkEnd w:id="3"/>
+      <w:bookmarkEnd w:id="4"/>
+    </w:p>
+    <w:tbl>
+      <w:tblPr>
+        <w:tblStyle w:val="10"/>
+        <w:tblpPr w:leftFromText="180" w:rightFromText="180" w:vertAnchor="text" w:horzAnchor="page" w:tblpXSpec="center" w:tblpY="299"/>
+        <w:tblOverlap w:val="never"/>
+        <w:tblW w:w="10048" w:type="dxa"/>
+        <w:jc w:val="center"/>
+        <w:tblBorders>
+          <w:top w:val="single" w:color="auto" w:sz="6" w:space="0"/>
+          <w:left w:val="single" w:color="auto" w:sz="6" w:space="0"/>
+          <w:bottom w:val="single" w:color="auto" w:sz="6" w:space="0"/>
+          <w:right w:val="single" w:color="auto" w:sz="6" w:space="0"/>
+          <w:insideH w:val="single" w:color="auto" w:sz="6" w:space="0"/>
+          <w:insideV w:val="single" w:color="auto" w:sz="6" w:space="0"/>
+        </w:tblBorders>
+        <w:tblLayout w:type="fixed"/>
+        <w:tblCellMar>
+          <w:top w:w="0" w:type="dxa"/>
+          <w:left w:w="108" w:type="dxa"/>
+          <w:bottom w:w="0" w:type="dxa"/>
+          <w:right w:w="108" w:type="dxa"/>
+        </w:tblCellMar>
+      </w:tblPr>
+      <w:tblGrid>
+        <w:gridCol w:w="737"/>
+        <w:gridCol w:w="1701"/>
+        <w:gridCol w:w="2508"/>
+        <w:gridCol w:w="1134"/>
+        <w:gridCol w:w="1417"/>
+        <w:gridCol w:w="1417"/>
+        <w:gridCol w:w="1134"/>
+      </w:tblGrid>
+      <w:tr>
+        <w:tblPrEx>
+          <w:tblBorders>
+            <w:top w:val="single" w:color="auto" w:sz="6" w:space="0"/>
+            <w:left w:val="single" w:color="auto" w:sz="6" w:space="0"/>
+            <w:bottom w:val="single" w:color="auto" w:sz="6" w:space="0"/>
+            <w:right w:val="single" w:color="auto" w:sz="6" w:space="0"/>
+            <w:insideH w:val="single" w:color="auto" w:sz="6" w:space="0"/>
+            <w:insideV w:val="single" w:color="auto" w:sz="6" w:space="0"/>
+          </w:tblBorders>
+          <w:tblCellMar>
+            <w:top w:w="0" w:type="dxa"/>
+            <w:left w:w="108" w:type="dxa"/>
+            <w:bottom w:w="0" w:type="dxa"/>
+            <w:right w:w="108" w:type="dxa"/>
+          </w:tblCellMar>
+        </w:tblPrEx>
+        <w:trPr>
+          <w:trHeight w:val="312" w:hRule="atLeast"/>
+          <w:jc w:val="center"/>
+        </w:trPr>
+        <w:tc>
+          <w:tcPr>
+            <w:tcW w:w="737" w:type="dxa"/>
+            <w:vMerge w:val="restart"/>
+            <w:tcBorders>
+              <w:tl2br w:val="nil"/>
+              <w:tr2bl w:val="nil"/>
+            </w:tcBorders>
+            <w:shd w:val="clear" w:color="auto" w:fill="auto"/>
+            <w:noWrap w:val="0"/>
+            <w:vAlign w:val="center"/>
+          </w:tcPr>
+          <w:p>
+            <w:pPr>
+              <w:jc w:val="center"/>
+              <w:rPr>
+                <w:rFonts w:hint="eastAsia" w:ascii="宋体" w:hAnsi="宋体" w:eastAsia="宋体" w:cs="宋体"/>
+                <w:b/>
+                <w:sz w:val="21"/>
+                <w:szCs w:val="21"/>
+              </w:rPr>
+            </w:pPr>
+            <w:r>
+              <w:rPr>
+                <w:rFonts w:hint="eastAsia" w:ascii="宋体" w:hAnsi="宋体" w:eastAsia="宋体" w:cs="宋体"/>
+                <w:b/>
+                <w:sz w:val="21"/>
+                <w:szCs w:val="21"/>
+              </w:rPr>
+              <w:t>序号</w:t>
+            </w:r>
+          </w:p>
+        </w:tc>
+        <w:tc>
+          <w:tcPr>
+            <w:tcW w:w="1701" w:type="dxa"/>
+            <w:vMerge w:val="restart"/>
+            <w:tcBorders>
+              <w:tl2br w:val="nil"/>
+              <w:tr2bl w:val="nil"/>
+            </w:tcBorders>
+            <w:shd w:val="clear" w:color="auto" w:fill="auto"/>
+            <w:noWrap w:val="0"/>
+            <w:vAlign w:val="center"/>
+          </w:tcPr>
+          <w:p>
+            <w:pPr>
+              <w:jc w:val="center"/>
+              <w:rPr>
+                <w:rFonts w:hint="eastAsia" w:ascii="宋体" w:hAnsi="宋体" w:eastAsia="宋体" w:cs="宋体"/>
+                <w:b/>
+                <w:sz w:val="21"/>
+                <w:szCs w:val="21"/>
+              </w:rPr>
+            </w:pPr>
+            <w:r>
+              <w:rPr>
+                <w:rFonts w:hint="eastAsia" w:ascii="宋体" w:hAnsi="宋体" w:eastAsia="宋体" w:cs="宋体"/>
+                <w:b/>
+                <w:sz w:val="21"/>
+                <w:szCs w:val="21"/>
+                <w:lang w:val="en-US" w:eastAsia="zh-CN"/>
+              </w:rPr>
+              <w:t>试验</w:t>
+            </w:r>
+            <w:r>
+              <w:rPr>
+                <w:rFonts w:hint="eastAsia" w:ascii="宋体" w:hAnsi="宋体" w:eastAsia="宋体" w:cs="宋体"/>
+                <w:b/>
+                <w:sz w:val="21"/>
+                <w:szCs w:val="21"/>
+              </w:rPr>
+              <w:t>项目</w:t>
+            </w:r>
+          </w:p>
+        </w:tc>
+        <w:tc>
+          <w:tcPr>
+            <w:tcW w:w="2508" w:type="dxa"/>
+            <w:vMerge w:val="restart"/>
+            <w:tcBorders>
+              <w:tl2br w:val="nil"/>
+              <w:tr2bl w:val="nil"/>
+            </w:tcBorders>
+            <w:shd w:val="clear" w:color="auto" w:fill="auto"/>
+            <w:noWrap w:val="0"/>
+            <w:vAlign w:val="center"/>
+          </w:tcPr>
+          <w:p>
+            <w:pPr>
+              <w:jc w:val="center"/>
+              <w:rPr>
+                <w:rFonts w:hint="eastAsia" w:ascii="宋体" w:hAnsi="宋体" w:eastAsia="宋体" w:cs="宋体"/>
+                <w:b/>
+                <w:color w:val="auto"/>
+                <w:sz w:val="21"/>
+                <w:szCs w:val="21"/>
+                <w:lang w:val="en-US" w:eastAsia="zh-CN"/>
+              </w:rPr>
+            </w:pPr>
+            <w:r>
+              <w:rPr>
+                <w:rFonts w:hint="eastAsia" w:ascii="宋体" w:hAnsi="宋体" w:eastAsia="宋体" w:cs="宋体"/>
+                <w:b/>
+                <w:color w:val="auto"/>
+                <w:sz w:val="21"/>
+                <w:szCs w:val="21"/>
+                <w:lang w:val="en-US" w:eastAsia="zh-CN"/>
+              </w:rPr>
+              <w:t>标准号/条款号</w:t>
+            </w:r>
+          </w:p>
+        </w:tc>
+        <w:tc>
+          <w:tcPr>
+            <w:tcW w:w="1134" w:type="dxa"/>
+            <w:vMerge w:val="restart"/>
+            <w:tcBorders>
+              <w:tl2br w:val="nil"/>
+              <w:tr2bl w:val="nil"/>
+            </w:tcBorders>
+            <w:shd w:val="clear" w:color="auto" w:fill="auto"/>
+            <w:noWrap w:val="0"/>
+            <w:vAlign w:val="center"/>
+          </w:tcPr>
+          <w:p>
+            <w:pPr>
+              <w:jc w:val="center"/>
+              <w:rPr>
+                <w:rFonts w:hint="eastAsia" w:ascii="宋体" w:hAnsi="宋体" w:eastAsia="宋体" w:cs="宋体"/>
+                <w:b/>
+                <w:color w:val="auto"/>
+                <w:sz w:val="21"/>
+                <w:szCs w:val="21"/>
+                <w:lang w:val="en-US" w:eastAsia="zh-CN"/>
+              </w:rPr>
+            </w:pPr>
+            <w:r>
+              <w:rPr>
+                <w:rFonts w:hint="eastAsia" w:ascii="宋体" w:hAnsi="宋体" w:eastAsia="宋体" w:cs="宋体"/>
+                <w:b/>
+                <w:color w:val="auto"/>
+                <w:sz w:val="21"/>
+                <w:szCs w:val="21"/>
+                <w:lang w:val="en-US" w:eastAsia="zh-CN"/>
+              </w:rPr>
+              <w:t>样机编号</w:t>
+            </w:r>
+          </w:p>
+        </w:tc>
+        <w:tc>
+          <w:tcPr>
+            <w:tcW w:w="2834" w:type="dxa"/>
+            <w:gridSpan w:val="2"/>
+            <w:tcBorders>
+              <w:tl2br w:val="nil"/>
+              <w:tr2bl w:val="nil"/>
+            </w:tcBorders>
+            <w:shd w:val="clear" w:color="auto" w:fill="auto"/>
+            <w:noWrap w:val="0"/>
+            <w:vAlign w:val="center"/>
+          </w:tcPr>
+          <w:p>
+            <w:pPr>
+              <w:jc w:val="center"/>
+              <w:rPr>
+                <w:rFonts w:hint="eastAsia" w:ascii="宋体" w:hAnsi="宋体" w:eastAsia="宋体" w:cs="宋体"/>
+                <w:b/>
+                <w:sz w:val="21"/>
+                <w:szCs w:val="21"/>
+              </w:rPr>
+            </w:pPr>
+            <w:r>
+              <w:rPr>
+                <w:rFonts w:hint="eastAsia" w:ascii="宋体" w:hAnsi="宋体" w:eastAsia="宋体" w:cs="宋体"/>
+                <w:b/>
+                <w:sz w:val="21"/>
+                <w:szCs w:val="21"/>
+                <w:highlight w:val="none"/>
+                <w:lang w:val="en-US" w:eastAsia="zh-CN"/>
+              </w:rPr>
+              <w:t>测试日期</w:t>
+            </w:r>
+          </w:p>
+        </w:tc>
+        <w:tc>
+          <w:tcPr>
+            <w:tcW w:w="1134" w:type="dxa"/>
+            <w:vMerge w:val="restart"/>
+            <w:tcBorders>
+              <w:tl2br w:val="nil"/>
+              <w:tr2bl w:val="nil"/>
+            </w:tcBorders>
+            <w:shd w:val="clear" w:color="F1F1F1" w:fill="auto"/>
+            <w:noWrap w:val="0"/>
+            <w:vAlign w:val="center"/>
+          </w:tcPr>
+          <w:p>
+            <w:pPr>
+              <w:jc w:val="center"/>
+              <w:rPr>
+                <w:rFonts w:hint="eastAsia" w:ascii="宋体" w:hAnsi="宋体" w:eastAsia="宋体" w:cs="宋体"/>
+                <w:b/>
+                <w:sz w:val="21"/>
+                <w:szCs w:val="21"/>
+              </w:rPr>
+            </w:pPr>
+            <w:r>
+              <w:rPr>
+                <w:rFonts w:hint="eastAsia" w:ascii="宋体" w:hAnsi="宋体" w:eastAsia="宋体" w:cs="宋体"/>
+                <w:b/>
+                <w:sz w:val="21"/>
+                <w:szCs w:val="21"/>
+                <w:lang w:val="en-US" w:eastAsia="zh-CN"/>
+              </w:rPr>
+              <w:t>试验</w:t>
+            </w:r>
+            <w:r>
+              <w:rPr>
+                <w:rFonts w:hint="eastAsia" w:ascii="宋体" w:hAnsi="宋体" w:eastAsia="宋体" w:cs="宋体"/>
+                <w:b/>
+                <w:sz w:val="21"/>
+                <w:szCs w:val="21"/>
+              </w:rPr>
+              <w:t>结果</w:t>
+            </w:r>
+          </w:p>
+        </w:tc>
+      </w:tr>
+      <w:tr>
+        <w:tblPrEx>
+          <w:tblBorders>
+            <w:top w:val="single" w:color="auto" w:sz="6" w:space="0"/>
+            <w:left w:val="single" w:color="auto" w:sz="6" w:space="0"/>
+            <w:bottom w:val="single" w:color="auto" w:sz="6" w:space="0"/>
+            <w:right w:val="single" w:color="auto" w:sz="6" w:space="0"/>
+            <w:insideH w:val="single" w:color="auto" w:sz="6" w:space="0"/>
+            <w:insideV w:val="single" w:color="auto" w:sz="6" w:space="0"/>
+          </w:tblBorders>
+          <w:tblCellMar>
+            <w:top w:w="0" w:type="dxa"/>
+            <w:left w:w="108" w:type="dxa"/>
+            <w:bottom w:w="0" w:type="dxa"/>
+            <w:right w:w="108" w:type="dxa"/>
+          </w:tblCellMar>
+        </w:tblPrEx>
+        <w:trPr>
+          <w:trHeight w:val="287" w:hRule="atLeast"/>
+          <w:jc w:val="center"/>
+        </w:trPr>
+        <w:tc>
+          <w:tcPr>
+            <w:tcW w:w="737" w:type="dxa"/>
+            <w:vMerge w:val="continue"/>
+            <w:tcBorders>
+              <w:tl2br w:val="nil"/>
+              <w:tr2bl w:val="nil"/>
+            </w:tcBorders>
+            <w:shd w:val="clear" w:color="auto" w:fill="auto"/>
+            <w:noWrap w:val="0"/>
+            <w:vAlign w:val="center"/>
+          </w:tcPr>
+          <w:p>
+            <w:pPr>
+              <w:jc w:val="center"/>
+              <w:rPr>
+                <w:rFonts w:hint="eastAsia" w:ascii="宋体" w:hAnsi="宋体" w:eastAsia="宋体" w:cs="宋体"/>
+                <w:b/>
+                <w:sz w:val="21"/>
+                <w:szCs w:val="21"/>
+              </w:rPr>
+            </w:pPr>
+          </w:p>
+        </w:tc>
+        <w:tc>
+          <w:tcPr>
+            <w:tcW w:w="1701" w:type="dxa"/>
+            <w:vMerge w:val="continue"/>
+            <w:tcBorders>
+              <w:tl2br w:val="nil"/>
+              <w:tr2bl w:val="nil"/>
+            </w:tcBorders>
+            <w:shd w:val="clear" w:color="auto" w:fill="auto"/>
+            <w:noWrap w:val="0"/>
+            <w:vAlign w:val="center"/>
+          </w:tcPr>
+          <w:p>
+            <w:pPr>
+              <w:jc w:val="center"/>
+              <w:rPr>
+                <w:rFonts w:hint="eastAsia" w:ascii="宋体" w:hAnsi="宋体" w:eastAsia="宋体" w:cs="宋体"/>
+                <w:b/>
+                <w:sz w:val="21"/>
+                <w:szCs w:val="21"/>
+              </w:rPr>
+            </w:pPr>
+          </w:p>
+        </w:tc>
+        <w:tc>
+          <w:tcPr>
+            <w:tcW w:w="2508" w:type="dxa"/>
+            <w:vMerge w:val="continue"/>
+            <w:tcBorders>
+              <w:tl2br w:val="nil"/>
+              <w:tr2bl w:val="nil"/>
+            </w:tcBorders>
+            <w:shd w:val="clear" w:color="auto" w:fill="auto"/>
+            <w:noWrap w:val="0"/>
+            <w:vAlign w:val="center"/>
+          </w:tcPr>
+          <w:p>
+            <w:pPr>
+              <w:jc w:val="center"/>
+              <w:rPr>
+                <w:rFonts w:hint="eastAsia" w:ascii="宋体" w:hAnsi="宋体" w:eastAsia="宋体" w:cs="宋体"/>
+                <w:b/>
+                <w:sz w:val="21"/>
+                <w:szCs w:val="21"/>
+              </w:rPr>
+            </w:pPr>
+          </w:p>
+        </w:tc>
+        <w:tc>
+          <w:tcPr>
+            <w:tcW w:w="1134" w:type="dxa"/>
+            <w:vMerge w:val="continue"/>
+            <w:tcBorders>
+              <w:tl2br w:val="nil"/>
+              <w:tr2bl w:val="nil"/>
+            </w:tcBorders>
+            <w:shd w:val="clear" w:color="auto" w:fill="auto"/>
+            <w:noWrap w:val="0"/>
+            <w:vAlign w:val="center"/>
+          </w:tcPr>
+          <w:p>
+            <w:pPr>
+              <w:jc w:val="center"/>
+              <w:rPr>
+                <w:rFonts w:hint="eastAsia" w:ascii="宋体" w:hAnsi="宋体" w:eastAsia="宋体" w:cs="宋体"/>
+                <w:b/>
+                <w:sz w:val="21"/>
+                <w:szCs w:val="21"/>
+              </w:rPr>
+            </w:pPr>
+          </w:p>
+        </w:tc>
+        <w:tc>
+          <w:tcPr>
+            <w:tcW w:w="1417" w:type="dxa"/>
+            <w:tcBorders>
+              <w:tl2br w:val="nil"/>
+              <w:tr2bl w:val="nil"/>
+            </w:tcBorders>
+            <w:shd w:val="clear" w:color="auto" w:fill="auto"/>
+            <w:noWrap w:val="0"/>
+            <w:vAlign w:val="center"/>
+          </w:tcPr>
+          <w:p>
+            <w:pPr>
+              <w:jc w:val="center"/>
+              <w:rPr>
+                <w:rFonts w:hint="eastAsia" w:ascii="宋体" w:hAnsi="宋体" w:eastAsia="宋体" w:cs="宋体"/>
+                <w:b/>
+                <w:sz w:val="21"/>
+                <w:szCs w:val="21"/>
+                <w:highlight w:val="yellow"/>
+              </w:rPr>
+            </w:pPr>
+            <w:r>
+              <w:rPr>
+                <w:rFonts w:hint="eastAsia" w:ascii="宋体" w:hAnsi="宋体" w:eastAsia="宋体" w:cs="宋体"/>
+                <w:b/>
+                <w:sz w:val="21"/>
+                <w:szCs w:val="21"/>
+                <w:highlight w:val="none"/>
+              </w:rPr>
+              <w:t>开始时间</w:t>
+            </w:r>
+          </w:p>
+        </w:tc>
+        <w:tc>
+          <w:tcPr>
+            <w:tcW w:w="1417" w:type="dxa"/>
+            <w:tcBorders>
+              <w:tl2br w:val="nil"/>
+              <w:tr2bl w:val="nil"/>
+            </w:tcBorders>
+            <w:shd w:val="clear" w:color="auto" w:fill="auto"/>
+            <w:noWrap w:val="0"/>
+            <w:vAlign w:val="center"/>
+          </w:tcPr>
+          <w:p>
+            <w:pPr>
+              <w:jc w:val="center"/>
+              <w:rPr>
+                <w:rFonts w:hint="eastAsia" w:ascii="宋体" w:hAnsi="宋体" w:eastAsia="宋体" w:cs="宋体"/>
+                <w:b/>
+                <w:sz w:val="21"/>
+                <w:szCs w:val="21"/>
+                <w:highlight w:val="yellow"/>
+              </w:rPr>
+            </w:pPr>
+            <w:r>
+              <w:rPr>
+                <w:rFonts w:hint="eastAsia" w:ascii="宋体" w:hAnsi="宋体" w:eastAsia="宋体" w:cs="宋体"/>
+                <w:b/>
+                <w:sz w:val="21"/>
+                <w:szCs w:val="21"/>
+                <w:highlight w:val="none"/>
+              </w:rPr>
+              <w:t>完成时间</w:t>
+            </w:r>
+          </w:p>
+        </w:tc>
+        <w:tc>
+          <w:tcPr>
+            <w:tcW w:w="1134" w:type="dxa"/>
+            <w:vMerge w:val="continue"/>
+            <w:tcBorders>
+              <w:tl2br w:val="nil"/>
+              <w:tr2bl w:val="nil"/>
+            </w:tcBorders>
+            <w:shd w:val="clear" w:color="F1F1F1" w:fill="auto"/>
+            <w:noWrap w:val="0"/>
+            <w:vAlign w:val="center"/>
+          </w:tcPr>
+          <w:p>
+            <w:pPr>
+              <w:jc w:val="center"/>
+              <w:rPr>
+                <w:rFonts w:hint="eastAsia" w:ascii="宋体" w:hAnsi="宋体" w:eastAsia="宋体" w:cs="宋体"/>
+                <w:b/>
+                <w:sz w:val="21"/>
+                <w:szCs w:val="21"/>
+              </w:rPr>
+            </w:pPr>
+          </w:p>
+        </w:tc>
+      </w:tr>
+      <w:tr>
+        <w:tblPrEx>
+          <w:tblBorders>
+            <w:top w:val="single" w:color="auto" w:sz="6" w:space="0"/>
+            <w:left w:val="single" w:color="auto" w:sz="6" w:space="0"/>
+            <w:bottom w:val="single" w:color="auto" w:sz="6" w:space="0"/>
+            <w:right w:val="single" w:color="auto" w:sz="6" w:space="0"/>
+            <w:insideH w:val="single" w:color="auto" w:sz="6" w:space="0"/>
+            <w:insideV w:val="single" w:color="auto" w:sz="6" w:space="0"/>
+          </w:tblBorders>
+          <w:tblCellMar>
+            <w:top w:w="0" w:type="dxa"/>
+            <w:left w:w="108" w:type="dxa"/>
+            <w:bottom w:w="0" w:type="dxa"/>
+            <w:right w:w="108" w:type="dxa"/>
+          </w:tblCellMar>
+        </w:tblPrEx>
+        <w:trPr>
+          <w:trHeight w:val="738" w:hRule="atLeast"/>
+          <w:jc w:val="center"/>
+        </w:trPr>
+        <w:tc>
+          <w:tcPr>
+            <w:tcW w:w="737" w:type="dxa"/>
+            <w:tcBorders>
+              <w:tl2br w:val="nil"/>
+              <w:tr2bl w:val="nil"/>
+            </w:tcBorders>
+            <w:shd w:val="clear" w:color="auto" w:fill="auto"/>
+            <w:noWrap w:val="0"/>
+            <w:vAlign w:val="center"/>
+          </w:tcPr>
+          <w:p>
+            <w:pPr>
+              <w:autoSpaceDE w:val="0"/>
+              <w:autoSpaceDN w:val="0"/>
+              <w:adjustRightInd w:val="0"/>
+              <w:jc w:val="center"/>
+              <w:rPr>
+                <w:rFonts w:hint="eastAsia" w:ascii="宋体" w:hAnsi="宋体" w:eastAsia="宋体" w:cs="宋体"/>
+                <w:kern w:val="2"/>
+                <w:sz w:val="21"/>
+                <w:szCs w:val="21"/>
+                <w:lang w:val="en-US" w:eastAsia="zh-CN" w:bidi="ar-SA"/>
+              </w:rPr>
+            </w:pPr>
+            <w:r>
+              <w:rPr>
+                <w:rFonts w:hint="eastAsia" w:ascii="宋体" w:hAnsi="宋体" w:eastAsia="宋体" w:cs="宋体"/>
+                <w:kern w:val="2"/>
+                <w:sz w:val="21"/>
+                <w:szCs w:val="21"/>
+                <w:lang w:val="en-US" w:eastAsia="zh-CN" w:bidi="ar-SA"/>
+              </w:rPr>
+              <w:t>1</w:t>
+            </w:r>
+          </w:p>
+        </w:tc>
+        <w:tc>
+          <w:tcPr>
+            <w:tcW w:w="1701" w:type="dxa"/>
+            <w:tcBorders>
+              <w:tl2br w:val="nil"/>
+              <w:tr2bl w:val="nil"/>
+            </w:tcBorders>
+            <w:shd w:val="clear" w:color="auto" w:fill="auto"/>
+            <w:noWrap w:val="0"/>
+            <w:vAlign w:val="center"/>
+          </w:tcPr>
+          <w:p>
+            <w:pPr>
+              <w:autoSpaceDE w:val="0"/>
+              <w:autoSpaceDN w:val="0"/>
+              <w:adjustRightInd w:val="0"/>
+              <w:jc w:val="center"/>
+              <w:rPr>
+                <w:rFonts w:hint="eastAsia" w:ascii="宋体" w:hAnsi="宋体" w:eastAsia="宋体" w:cs="宋体"/>
+                <w:kern w:val="2"/>
+                <w:sz w:val="21"/>
+                <w:szCs w:val="21"/>
+                <w:lang w:val="en-US" w:eastAsia="zh-CN" w:bidi="ar-SA"/>
+              </w:rPr>
+            </w:pPr>
+            <w:bookmarkStart w:id="5" w:name="_GoBack"/>
+            <w:bookmarkEnd w:id="5"/>
+          </w:p>
+        </w:tc>
+        <w:tc>
+          <w:tcPr>
+            <w:tcW w:w="2508" w:type="dxa"/>
+            <w:tcBorders>
+              <w:tl2br w:val="nil"/>
+              <w:tr2bl w:val="nil"/>
+            </w:tcBorders>
+            <w:shd w:val="clear" w:color="auto" w:fill="auto"/>
+            <w:noWrap w:val="0"/>
+            <w:vAlign w:val="center"/>
+          </w:tcPr>
+          <w:p>
+            <w:pPr>
+              <w:ind w:firstLine="0" w:firstLineChars="0"/>
+              <w:jc w:val="center"/>
+              <w:rPr>
+                <w:rFonts w:hint="default" w:ascii="宋体" w:hAnsi="宋体" w:eastAsia="宋体" w:cs="宋体"/>
+                <w:kern w:val="2"/>
+                <w:sz w:val="21"/>
+                <w:szCs w:val="21"/>
+                <w:lang w:val="en-US" w:eastAsia="zh-CN" w:bidi="ar-SA"/>
+              </w:rPr>
+            </w:pPr>
+          </w:p>
+        </w:tc>
+        <w:tc>
+          <w:tcPr>
+            <w:tcW w:w="1134" w:type="dxa"/>
+            <w:tcBorders>
+              <w:tl2br w:val="nil"/>
+              <w:tr2bl w:val="nil"/>
+            </w:tcBorders>
+            <w:shd w:val="clear" w:color="auto" w:fill="auto"/>
+            <w:noWrap w:val="0"/>
+            <w:vAlign w:val="center"/>
+          </w:tcPr>
+          <w:p>
+            <w:pPr>
+              <w:autoSpaceDE w:val="0"/>
+              <w:autoSpaceDN w:val="0"/>
+              <w:adjustRightInd w:val="0"/>
+              <w:jc w:val="center"/>
+              <w:rPr>
+                <w:rFonts w:hint="default" w:ascii="宋体" w:hAnsi="宋体" w:cs="宋体"/>
+                <w:kern w:val="2"/>
+                <w:sz w:val="21"/>
+                <w:szCs w:val="21"/>
+                <w:lang w:val="en-US" w:eastAsia="zh-CN" w:bidi="ar-SA"/>
+              </w:rPr>
+            </w:pPr>
+          </w:p>
+        </w:tc>
+        <w:tc>
+          <w:tcPr>
+            <w:tcW w:w="1417" w:type="dxa"/>
+            <w:tcBorders>
+              <w:tl2br w:val="nil"/>
+              <w:tr2bl w:val="nil"/>
+            </w:tcBorders>
+            <w:shd w:val="clear" w:color="auto" w:fill="auto"/>
+            <w:noWrap w:val="0"/>
+            <w:vAlign w:val="center"/>
+          </w:tcPr>
+          <w:p>
+            <w:pPr>
+              <w:jc w:val="center"/>
+              <w:rPr>
+                <w:rFonts w:hint="default" w:ascii="宋体" w:hAnsi="宋体" w:eastAsia="宋体" w:cs="宋体"/>
+                <w:kern w:val="2"/>
+                <w:sz w:val="21"/>
+                <w:szCs w:val="21"/>
+                <w:lang w:val="en-US" w:eastAsia="zh-CN" w:bidi="ar-SA"/>
+              </w:rPr>
+            </w:pPr>
+          </w:p>
+        </w:tc>
+        <w:tc>
+          <w:tcPr>
+            <w:tcW w:w="1417" w:type="dxa"/>
+            <w:tcBorders>
+              <w:tl2br w:val="nil"/>
+              <w:tr2bl w:val="nil"/>
+            </w:tcBorders>
+            <w:shd w:val="clear" w:color="auto" w:fill="auto"/>
+            <w:noWrap w:val="0"/>
+            <w:vAlign w:val="center"/>
+          </w:tcPr>
+          <w:p>
+            <w:pPr>
+              <w:jc w:val="center"/>
+              <w:rPr>
+                <w:rFonts w:hint="default" w:ascii="宋体" w:hAnsi="宋体" w:eastAsia="宋体" w:cs="宋体"/>
+                <w:kern w:val="2"/>
+                <w:sz w:val="21"/>
+                <w:szCs w:val="21"/>
+                <w:lang w:val="en-US" w:eastAsia="zh-CN" w:bidi="ar-SA"/>
+              </w:rPr>
+            </w:pPr>
+          </w:p>
+        </w:tc>
+        <w:tc>
+          <w:tcPr>
+            <w:tcW w:w="1134" w:type="dxa"/>
+            <w:tcBorders>
+              <w:tl2br w:val="nil"/>
+              <w:tr2bl w:val="nil"/>
+            </w:tcBorders>
+            <w:shd w:val="clear" w:color="F1F1F1" w:fill="auto"/>
+            <w:noWrap w:val="0"/>
+            <w:vAlign w:val="center"/>
+          </w:tcPr>
+          <w:p>
+            <w:pPr>
+              <w:jc w:val="center"/>
+              <w:rPr>
+                <w:rFonts w:hint="default" w:ascii="宋体" w:hAnsi="宋体" w:cs="宋体"/>
+                <w:kern w:val="2"/>
+                <w:sz w:val="21"/>
+                <w:szCs w:val="21"/>
+                <w:lang w:val="en-US" w:eastAsia="zh-CN" w:bidi="ar-SA"/>
+              </w:rPr>
+            </w:pPr>
+          </w:p>
+        </w:tc>
+      </w:tr>
+      <w:tr>
+        <w:tblPrEx>
+          <w:tblBorders>
+            <w:top w:val="single" w:color="auto" w:sz="6" w:space="0"/>
+            <w:left w:val="single" w:color="auto" w:sz="6" w:space="0"/>
+            <w:bottom w:val="single" w:color="auto" w:sz="6" w:space="0"/>
+            <w:right w:val="single" w:color="auto" w:sz="6" w:space="0"/>
+            <w:insideH w:val="single" w:color="auto" w:sz="6" w:space="0"/>
+            <w:insideV w:val="single" w:color="auto" w:sz="6" w:space="0"/>
+          </w:tblBorders>
+          <w:tblCellMar>
+            <w:top w:w="0" w:type="dxa"/>
+            <w:left w:w="108" w:type="dxa"/>
+            <w:bottom w:w="0" w:type="dxa"/>
+            <w:right w:w="108" w:type="dxa"/>
+          </w:tblCellMar>
+        </w:tblPrEx>
+        <w:trPr>
+          <w:trHeight w:val="936" w:hRule="atLeast"/>
+          <w:jc w:val="center"/>
+        </w:trPr>
+        <w:tc>
+          <w:tcPr>
+            <w:tcW w:w="737" w:type="dxa"/>
+            <w:tcBorders>
+              <w:tl2br w:val="nil"/>
+              <w:tr2bl w:val="nil"/>
+            </w:tcBorders>
+            <w:noWrap w:val="0"/>
+            <w:vAlign w:val="center"/>
+          </w:tcPr>
+          <w:p>
+            <w:pPr>
+              <w:jc w:val="center"/>
+              <w:rPr>
+                <w:rFonts w:hint="eastAsia" w:ascii="宋体" w:hAnsi="宋体" w:eastAsia="宋体" w:cs="宋体"/>
+                <w:kern w:val="2"/>
+                <w:sz w:val="21"/>
+                <w:szCs w:val="21"/>
+                <w:lang w:val="en-US" w:eastAsia="zh-CN" w:bidi="ar-SA"/>
+              </w:rPr>
+            </w:pPr>
+            <w:r>
+              <w:rPr>
+                <w:rFonts w:hint="eastAsia" w:ascii="宋体" w:hAnsi="宋体" w:eastAsia="宋体" w:cs="宋体"/>
+                <w:kern w:val="2"/>
+                <w:sz w:val="21"/>
+                <w:szCs w:val="21"/>
+                <w:lang w:val="en-US" w:eastAsia="zh-CN" w:bidi="ar-SA"/>
+              </w:rPr>
+              <w:t>2</w:t>
+            </w:r>
+          </w:p>
+        </w:tc>
+        <w:tc>
+          <w:tcPr>
+            <w:tcW w:w="1701" w:type="dxa"/>
+            <w:tcBorders>
+              <w:tl2br w:val="nil"/>
+              <w:tr2bl w:val="nil"/>
+            </w:tcBorders>
+            <w:noWrap w:val="0"/>
+            <w:vAlign w:val="center"/>
+          </w:tcPr>
+          <w:p>
+            <w:pPr>
+              <w:autoSpaceDE w:val="0"/>
+              <w:autoSpaceDN w:val="0"/>
+              <w:adjustRightInd w:val="0"/>
+              <w:jc w:val="center"/>
+              <w:rPr>
+                <w:rFonts w:hint="eastAsia" w:ascii="宋体" w:hAnsi="宋体" w:eastAsia="宋体" w:cs="宋体"/>
+                <w:kern w:val="2"/>
+                <w:sz w:val="21"/>
+                <w:szCs w:val="21"/>
+                <w:lang w:val="en-US" w:eastAsia="zh-CN" w:bidi="ar-SA"/>
+              </w:rPr>
+            </w:pPr>
+          </w:p>
+        </w:tc>
+        <w:tc>
+          <w:tcPr>
+            <w:tcW w:w="2508" w:type="dxa"/>
+            <w:tcBorders>
+              <w:tl2br w:val="nil"/>
+              <w:tr2bl w:val="nil"/>
+            </w:tcBorders>
+            <w:noWrap w:val="0"/>
+            <w:vAlign w:val="center"/>
+          </w:tcPr>
+          <w:p>
+            <w:pPr>
+              <w:autoSpaceDE w:val="0"/>
+              <w:autoSpaceDN w:val="0"/>
+              <w:adjustRightInd w:val="0"/>
+              <w:jc w:val="center"/>
+              <w:rPr>
+                <w:rFonts w:hint="eastAsia" w:ascii="宋体" w:hAnsi="宋体" w:eastAsia="宋体" w:cs="宋体"/>
+                <w:kern w:val="2"/>
+                <w:sz w:val="21"/>
+                <w:szCs w:val="21"/>
+                <w:lang w:val="en-US" w:eastAsia="zh-CN" w:bidi="ar-SA"/>
+              </w:rPr>
+            </w:pPr>
+          </w:p>
+        </w:tc>
+        <w:tc>
+          <w:tcPr>
+            <w:tcW w:w="1134" w:type="dxa"/>
+            <w:tcBorders>
+              <w:tl2br w:val="nil"/>
+              <w:tr2bl w:val="nil"/>
+            </w:tcBorders>
+            <w:noWrap w:val="0"/>
+            <w:vAlign w:val="center"/>
+          </w:tcPr>
+          <w:p>
+            <w:pPr>
+              <w:autoSpaceDE w:val="0"/>
+              <w:autoSpaceDN w:val="0"/>
+              <w:adjustRightInd w:val="0"/>
+              <w:jc w:val="center"/>
+              <w:rPr>
+                <w:rFonts w:hint="default" w:ascii="宋体" w:hAnsi="宋体" w:eastAsia="宋体" w:cs="宋体"/>
+                <w:kern w:val="2"/>
+                <w:sz w:val="21"/>
+                <w:szCs w:val="21"/>
+                <w:lang w:val="en-US" w:eastAsia="zh-CN" w:bidi="ar-SA"/>
+              </w:rPr>
+            </w:pPr>
+          </w:p>
+        </w:tc>
+        <w:tc>
+          <w:tcPr>
+            <w:tcW w:w="1417" w:type="dxa"/>
+            <w:tcBorders>
+              <w:tl2br w:val="nil"/>
+              <w:tr2bl w:val="nil"/>
+            </w:tcBorders>
+            <w:noWrap w:val="0"/>
+            <w:vAlign w:val="center"/>
+          </w:tcPr>
+          <w:p>
+            <w:pPr>
+              <w:autoSpaceDE w:val="0"/>
+              <w:autoSpaceDN w:val="0"/>
+              <w:adjustRightInd w:val="0"/>
+              <w:jc w:val="center"/>
+              <w:rPr>
+                <w:rFonts w:hint="default" w:ascii="宋体" w:hAnsi="宋体" w:eastAsia="宋体" w:cs="宋体"/>
+                <w:kern w:val="2"/>
+                <w:sz w:val="21"/>
+                <w:szCs w:val="21"/>
+                <w:lang w:val="en-US" w:eastAsia="zh-CN" w:bidi="ar-SA"/>
+              </w:rPr>
+            </w:pPr>
+          </w:p>
+        </w:tc>
+        <w:tc>
+          <w:tcPr>
+            <w:tcW w:w="1417" w:type="dxa"/>
+            <w:tcBorders>
+              <w:tl2br w:val="nil"/>
+              <w:tr2bl w:val="nil"/>
+            </w:tcBorders>
+            <w:noWrap w:val="0"/>
+            <w:vAlign w:val="center"/>
+          </w:tcPr>
+          <w:p>
+            <w:pPr>
+              <w:autoSpaceDE w:val="0"/>
+              <w:autoSpaceDN w:val="0"/>
+              <w:adjustRightInd w:val="0"/>
+              <w:jc w:val="center"/>
+              <w:rPr>
+                <w:rFonts w:hint="default" w:ascii="宋体" w:hAnsi="宋体" w:eastAsia="宋体" w:cs="宋体"/>
+                <w:kern w:val="2"/>
+                <w:sz w:val="21"/>
+                <w:szCs w:val="21"/>
+                <w:lang w:val="en-US" w:eastAsia="zh-CN" w:bidi="ar-SA"/>
+              </w:rPr>
+            </w:pPr>
+          </w:p>
+        </w:tc>
+        <w:tc>
+          <w:tcPr>
+            <w:tcW w:w="1134" w:type="dxa"/>
+            <w:tcBorders>
+              <w:tl2br w:val="nil"/>
+              <w:tr2bl w:val="nil"/>
+            </w:tcBorders>
+            <w:noWrap w:val="0"/>
+            <w:vAlign w:val="center"/>
+          </w:tcPr>
+          <w:p>
+            <w:pPr>
+              <w:jc w:val="center"/>
+              <w:rPr>
+                <w:rFonts w:hint="eastAsia" w:ascii="宋体" w:hAnsi="宋体" w:eastAsia="宋体" w:cs="宋体"/>
+                <w:kern w:val="2"/>
+                <w:sz w:val="21"/>
+                <w:szCs w:val="21"/>
+                <w:lang w:val="en-US" w:eastAsia="zh-CN" w:bidi="ar-SA"/>
+              </w:rPr>
+            </w:pPr>
+          </w:p>
+        </w:tc>
+      </w:tr>
+      <w:tr>
+        <w:tblPrEx>
+          <w:tblBorders>
+            <w:top w:val="single" w:color="auto" w:sz="6" w:space="0"/>
+            <w:left w:val="single" w:color="auto" w:sz="6" w:space="0"/>
+            <w:bottom w:val="single" w:color="auto" w:sz="6" w:space="0"/>
+            <w:right w:val="single" w:color="auto" w:sz="6" w:space="0"/>
+            <w:insideH w:val="single" w:color="auto" w:sz="6" w:space="0"/>
+            <w:insideV w:val="single" w:color="auto" w:sz="6" w:space="0"/>
+          </w:tblBorders>
+          <w:tblCellMar>
+            <w:top w:w="0" w:type="dxa"/>
+            <w:left w:w="108" w:type="dxa"/>
+            <w:bottom w:w="0" w:type="dxa"/>
+            <w:right w:w="108" w:type="dxa"/>
+          </w:tblCellMar>
+        </w:tblPrEx>
+        <w:trPr>
+          <w:trHeight w:val="936" w:hRule="atLeast"/>
+          <w:jc w:val="center"/>
+        </w:trPr>
+        <w:tc>
+          <w:tcPr>
+            <w:tcW w:w="737" w:type="dxa"/>
+            <w:tcBorders>
+              <w:tl2br w:val="nil"/>
+              <w:tr2bl w:val="nil"/>
+            </w:tcBorders>
+            <w:noWrap w:val="0"/>
+            <w:vAlign w:val="center"/>
+          </w:tcPr>
+          <w:p>
+            <w:pPr>
+              <w:jc w:val="center"/>
+              <w:rPr>
+                <w:rFonts w:hint="default" w:ascii="宋体" w:hAnsi="宋体" w:eastAsia="宋体" w:cs="宋体"/>
+                <w:kern w:val="2"/>
+                <w:sz w:val="21"/>
+                <w:szCs w:val="21"/>
+                <w:lang w:val="en-US" w:eastAsia="zh-CN" w:bidi="ar-SA"/>
+              </w:rPr>
+            </w:pPr>
+            <w:r>
+              <w:rPr>
+                <w:rFonts w:hint="eastAsia" w:ascii="宋体" w:hAnsi="宋体" w:cs="宋体"/>
+                <w:kern w:val="2"/>
+                <w:sz w:val="21"/>
+                <w:szCs w:val="21"/>
+                <w:lang w:val="en-US" w:eastAsia="zh-CN" w:bidi="ar-SA"/>
+              </w:rPr>
+              <w:t>3</w:t>
+            </w:r>
+          </w:p>
+        </w:tc>
+        <w:tc>
+          <w:tcPr>
+            <w:tcW w:w="1701" w:type="dxa"/>
+            <w:tcBorders>
+              <w:tl2br w:val="nil"/>
+              <w:tr2bl w:val="nil"/>
+            </w:tcBorders>
+            <w:noWrap w:val="0"/>
+            <w:vAlign w:val="center"/>
+          </w:tcPr>
+          <w:p>
+            <w:pPr>
+              <w:autoSpaceDE w:val="0"/>
+              <w:autoSpaceDN w:val="0"/>
+              <w:adjustRightInd w:val="0"/>
+              <w:jc w:val="center"/>
+              <w:rPr>
+                <w:rFonts w:hint="eastAsia" w:ascii="宋体" w:hAnsi="宋体" w:eastAsia="宋体" w:cs="宋体"/>
+                <w:kern w:val="2"/>
+                <w:sz w:val="21"/>
+                <w:szCs w:val="21"/>
+                <w:lang w:val="en-US" w:eastAsia="zh-CN" w:bidi="ar-SA"/>
+              </w:rPr>
+            </w:pPr>
+          </w:p>
+        </w:tc>
+        <w:tc>
+          <w:tcPr>
+            <w:tcW w:w="2508" w:type="dxa"/>
+            <w:tcBorders>
+              <w:tl2br w:val="nil"/>
+              <w:tr2bl w:val="nil"/>
+            </w:tcBorders>
+            <w:noWrap w:val="0"/>
+            <w:vAlign w:val="center"/>
+          </w:tcPr>
+          <w:p>
+            <w:pPr>
+              <w:autoSpaceDE w:val="0"/>
+              <w:autoSpaceDN w:val="0"/>
+              <w:adjustRightInd w:val="0"/>
+              <w:jc w:val="center"/>
+              <w:rPr>
+                <w:rFonts w:hint="eastAsia" w:ascii="宋体" w:hAnsi="宋体" w:eastAsia="宋体" w:cs="宋体"/>
+                <w:kern w:val="2"/>
+                <w:sz w:val="21"/>
+                <w:szCs w:val="21"/>
+                <w:lang w:val="en-US" w:eastAsia="zh-CN" w:bidi="ar-SA"/>
+              </w:rPr>
+            </w:pPr>
+          </w:p>
+        </w:tc>
+        <w:tc>
+          <w:tcPr>
+            <w:tcW w:w="1134" w:type="dxa"/>
+            <w:tcBorders>
+              <w:tl2br w:val="nil"/>
+              <w:tr2bl w:val="nil"/>
+            </w:tcBorders>
+            <w:noWrap w:val="0"/>
+            <w:vAlign w:val="center"/>
+          </w:tcPr>
+          <w:p>
+            <w:pPr>
+              <w:autoSpaceDE w:val="0"/>
+              <w:autoSpaceDN w:val="0"/>
+              <w:adjustRightInd w:val="0"/>
+              <w:jc w:val="center"/>
+              <w:rPr>
+                <w:rFonts w:hint="default" w:ascii="宋体" w:hAnsi="宋体" w:eastAsia="宋体" w:cs="宋体"/>
+                <w:kern w:val="2"/>
+                <w:sz w:val="21"/>
+                <w:szCs w:val="21"/>
+                <w:lang w:val="en-US" w:eastAsia="zh-CN" w:bidi="ar-SA"/>
+              </w:rPr>
+            </w:pPr>
+          </w:p>
+        </w:tc>
+        <w:tc>
+          <w:tcPr>
+            <w:tcW w:w="1417" w:type="dxa"/>
+            <w:tcBorders>
+              <w:tl2br w:val="nil"/>
+              <w:tr2bl w:val="nil"/>
+            </w:tcBorders>
+            <w:noWrap w:val="0"/>
+            <w:vAlign w:val="center"/>
+          </w:tcPr>
+          <w:p>
+            <w:pPr>
+              <w:autoSpaceDE w:val="0"/>
+              <w:autoSpaceDN w:val="0"/>
+              <w:adjustRightInd w:val="0"/>
+              <w:jc w:val="center"/>
+              <w:rPr>
+                <w:rFonts w:hint="default" w:ascii="宋体" w:hAnsi="宋体" w:eastAsia="宋体" w:cs="宋体"/>
+                <w:kern w:val="2"/>
+                <w:sz w:val="21"/>
+                <w:szCs w:val="21"/>
+                <w:lang w:val="en-US" w:eastAsia="zh-CN" w:bidi="ar-SA"/>
+              </w:rPr>
+            </w:pPr>
+          </w:p>
+        </w:tc>
+        <w:tc>
+          <w:tcPr>
+            <w:tcW w:w="1417" w:type="dxa"/>
+            <w:tcBorders>
+              <w:tl2br w:val="nil"/>
+              <w:tr2bl w:val="nil"/>
+            </w:tcBorders>
+            <w:noWrap w:val="0"/>
+            <w:vAlign w:val="center"/>
+          </w:tcPr>
+          <w:p>
+            <w:pPr>
+              <w:autoSpaceDE w:val="0"/>
+              <w:autoSpaceDN w:val="0"/>
+              <w:adjustRightInd w:val="0"/>
+              <w:jc w:val="center"/>
+              <w:rPr>
+                <w:rFonts w:hint="default" w:ascii="宋体" w:hAnsi="宋体" w:eastAsia="宋体" w:cs="宋体"/>
+                <w:kern w:val="2"/>
+                <w:sz w:val="21"/>
+                <w:szCs w:val="21"/>
+                <w:lang w:val="en-US" w:eastAsia="zh-CN" w:bidi="ar-SA"/>
+              </w:rPr>
+            </w:pPr>
+          </w:p>
+        </w:tc>
+        <w:tc>
+          <w:tcPr>
+            <w:tcW w:w="1134" w:type="dxa"/>
+            <w:tcBorders>
+              <w:tl2br w:val="nil"/>
+              <w:tr2bl w:val="nil"/>
+            </w:tcBorders>
+            <w:noWrap w:val="0"/>
+            <w:vAlign w:val="center"/>
+          </w:tcPr>
+          <w:p>
+            <w:pPr>
+              <w:jc w:val="center"/>
+              <w:rPr>
+                <w:rFonts w:hint="eastAsia" w:ascii="宋体" w:hAnsi="宋体" w:cs="宋体"/>
+                <w:kern w:val="2"/>
+                <w:sz w:val="21"/>
+                <w:szCs w:val="21"/>
+                <w:lang w:val="en-US" w:eastAsia="zh-CN" w:bidi="ar-SA"/>
+              </w:rPr>
+            </w:pPr>
+          </w:p>
+        </w:tc>
+      </w:tr>
+      <w:tr>
+        <w:tblPrEx>
+          <w:tblBorders>
+            <w:top w:val="single" w:color="auto" w:sz="6" w:space="0"/>
+            <w:left w:val="single" w:color="auto" w:sz="6" w:space="0"/>
+            <w:bottom w:val="single" w:color="auto" w:sz="6" w:space="0"/>
+            <w:right w:val="single" w:color="auto" w:sz="6" w:space="0"/>
+            <w:insideH w:val="single" w:color="auto" w:sz="6" w:space="0"/>
+            <w:insideV w:val="single" w:color="auto" w:sz="6" w:space="0"/>
+          </w:tblBorders>
+          <w:tblCellMar>
+            <w:top w:w="0" w:type="dxa"/>
+            <w:left w:w="108" w:type="dxa"/>
+            <w:bottom w:w="0" w:type="dxa"/>
+            <w:right w:w="108" w:type="dxa"/>
+          </w:tblCellMar>
+        </w:tblPrEx>
+        <w:trPr>
+          <w:trHeight w:val="936" w:hRule="atLeast"/>
+          <w:jc w:val="center"/>
+        </w:trPr>
+        <w:tc>
+          <w:tcPr>
+            <w:tcW w:w="737" w:type="dxa"/>
+            <w:tcBorders>
+              <w:tl2br w:val="nil"/>
+              <w:tr2bl w:val="nil"/>
+            </w:tcBorders>
+            <w:noWrap w:val="0"/>
+            <w:vAlign w:val="center"/>
+          </w:tcPr>
+          <w:p>
+            <w:pPr>
+              <w:jc w:val="center"/>
+              <w:rPr>
+                <w:rFonts w:hint="default" w:ascii="宋体" w:hAnsi="宋体" w:eastAsia="宋体" w:cs="宋体"/>
+                <w:kern w:val="2"/>
+                <w:sz w:val="21"/>
+                <w:szCs w:val="21"/>
+                <w:lang w:val="en-US" w:eastAsia="zh-CN" w:bidi="ar-SA"/>
+              </w:rPr>
+            </w:pPr>
+            <w:r>
+              <w:rPr>
+                <w:rFonts w:hint="eastAsia" w:ascii="宋体" w:hAnsi="宋体" w:cs="宋体"/>
+                <w:kern w:val="2"/>
+                <w:sz w:val="21"/>
+                <w:szCs w:val="21"/>
+                <w:lang w:val="en-US" w:eastAsia="zh-CN" w:bidi="ar-SA"/>
+              </w:rPr>
+              <w:t>4</w:t>
+            </w:r>
+          </w:p>
+        </w:tc>
+        <w:tc>
+          <w:tcPr>
+            <w:tcW w:w="1701" w:type="dxa"/>
+            <w:tcBorders>
+              <w:tl2br w:val="nil"/>
+              <w:tr2bl w:val="nil"/>
+            </w:tcBorders>
+            <w:noWrap w:val="0"/>
+            <w:vAlign w:val="center"/>
+          </w:tcPr>
+          <w:p>
+            <w:pPr>
+              <w:autoSpaceDE w:val="0"/>
+              <w:autoSpaceDN w:val="0"/>
+              <w:adjustRightInd w:val="0"/>
+              <w:jc w:val="center"/>
+              <w:rPr>
+                <w:rFonts w:hint="eastAsia" w:ascii="宋体" w:hAnsi="宋体" w:eastAsia="宋体" w:cs="宋体"/>
+                <w:kern w:val="2"/>
+                <w:sz w:val="21"/>
+                <w:szCs w:val="21"/>
+                <w:lang w:val="en-US" w:eastAsia="zh-CN" w:bidi="ar-SA"/>
+              </w:rPr>
+            </w:pPr>
+          </w:p>
+        </w:tc>
+        <w:tc>
+          <w:tcPr>
+            <w:tcW w:w="2508" w:type="dxa"/>
+            <w:tcBorders>
+              <w:tl2br w:val="nil"/>
+              <w:tr2bl w:val="nil"/>
+            </w:tcBorders>
+            <w:noWrap w:val="0"/>
+            <w:vAlign w:val="center"/>
+          </w:tcPr>
+          <w:p>
+            <w:pPr>
+              <w:autoSpaceDE w:val="0"/>
+              <w:autoSpaceDN w:val="0"/>
+              <w:adjustRightInd w:val="0"/>
+              <w:jc w:val="center"/>
+              <w:rPr>
+                <w:rFonts w:hint="eastAsia" w:ascii="宋体" w:hAnsi="宋体" w:eastAsia="宋体" w:cs="宋体"/>
+                <w:kern w:val="2"/>
+                <w:sz w:val="21"/>
+                <w:szCs w:val="21"/>
+                <w:lang w:val="en-US" w:eastAsia="zh-CN" w:bidi="ar-SA"/>
+              </w:rPr>
+            </w:pPr>
+          </w:p>
+        </w:tc>
+        <w:tc>
+          <w:tcPr>
+            <w:tcW w:w="1134" w:type="dxa"/>
+            <w:tcBorders>
+              <w:tl2br w:val="nil"/>
+              <w:tr2bl w:val="nil"/>
+            </w:tcBorders>
+            <w:noWrap w:val="0"/>
+            <w:vAlign w:val="center"/>
+          </w:tcPr>
+          <w:p>
+            <w:pPr>
+              <w:autoSpaceDE w:val="0"/>
+              <w:autoSpaceDN w:val="0"/>
+              <w:adjustRightInd w:val="0"/>
+              <w:jc w:val="center"/>
+              <w:rPr>
+                <w:rFonts w:hint="default" w:ascii="宋体" w:hAnsi="宋体" w:eastAsia="宋体" w:cs="宋体"/>
+                <w:kern w:val="2"/>
+                <w:sz w:val="21"/>
+                <w:szCs w:val="21"/>
+                <w:lang w:val="en-US" w:eastAsia="zh-CN" w:bidi="ar-SA"/>
+              </w:rPr>
+            </w:pPr>
+          </w:p>
+        </w:tc>
+        <w:tc>
+          <w:tcPr>
+            <w:tcW w:w="1417" w:type="dxa"/>
+            <w:tcBorders>
+              <w:tl2br w:val="nil"/>
+              <w:tr2bl w:val="nil"/>
+            </w:tcBorders>
+            <w:noWrap w:val="0"/>
+            <w:vAlign w:val="center"/>
+          </w:tcPr>
+          <w:p>
+            <w:pPr>
+              <w:autoSpaceDE w:val="0"/>
+              <w:autoSpaceDN w:val="0"/>
+              <w:adjustRightInd w:val="0"/>
+              <w:jc w:val="center"/>
+              <w:rPr>
+                <w:rFonts w:hint="default" w:ascii="宋体" w:hAnsi="宋体" w:eastAsia="宋体" w:cs="宋体"/>
+                <w:kern w:val="2"/>
+                <w:sz w:val="21"/>
+                <w:szCs w:val="21"/>
+                <w:lang w:val="en-US" w:eastAsia="zh-CN" w:bidi="ar-SA"/>
+              </w:rPr>
+            </w:pPr>
+          </w:p>
+        </w:tc>
+        <w:tc>
+          <w:tcPr>
+            <w:tcW w:w="1417" w:type="dxa"/>
+            <w:tcBorders>
+              <w:tl2br w:val="nil"/>
+              <w:tr2bl w:val="nil"/>
+            </w:tcBorders>
+            <w:noWrap w:val="0"/>
+            <w:vAlign w:val="center"/>
+          </w:tcPr>
+          <w:p>
+            <w:pPr>
+              <w:autoSpaceDE w:val="0"/>
+              <w:autoSpaceDN w:val="0"/>
+              <w:adjustRightInd w:val="0"/>
+              <w:jc w:val="center"/>
+              <w:rPr>
+                <w:rFonts w:hint="default" w:ascii="宋体" w:hAnsi="宋体" w:eastAsia="宋体" w:cs="宋体"/>
+                <w:kern w:val="2"/>
+                <w:sz w:val="21"/>
+                <w:szCs w:val="21"/>
+                <w:lang w:val="en-US" w:eastAsia="zh-CN" w:bidi="ar-SA"/>
+              </w:rPr>
+            </w:pPr>
+          </w:p>
+        </w:tc>
+        <w:tc>
+          <w:tcPr>
+            <w:tcW w:w="1134" w:type="dxa"/>
+            <w:tcBorders>
+              <w:tl2br w:val="nil"/>
+              <w:tr2bl w:val="nil"/>
+            </w:tcBorders>
+            <w:noWrap w:val="0"/>
+            <w:vAlign w:val="center"/>
+          </w:tcPr>
+          <w:p>
+            <w:pPr>
+              <w:jc w:val="center"/>
+              <w:rPr>
+                <w:rFonts w:hint="eastAsia" w:ascii="宋体" w:hAnsi="宋体" w:cs="宋体"/>
+                <w:kern w:val="2"/>
+                <w:sz w:val="21"/>
+                <w:szCs w:val="21"/>
+                <w:lang w:val="en-US" w:eastAsia="zh-CN" w:bidi="ar-SA"/>
+              </w:rPr>
+            </w:pPr>
+          </w:p>
+        </w:tc>
+      </w:tr>
+      <w:tr>
+        <w:tblPrEx>
+          <w:tblBorders>
+            <w:top w:val="single" w:color="auto" w:sz="6" w:space="0"/>
+            <w:left w:val="single" w:color="auto" w:sz="6" w:space="0"/>
+            <w:bottom w:val="single" w:color="auto" w:sz="6" w:space="0"/>
+            <w:right w:val="single" w:color="auto" w:sz="6" w:space="0"/>
+            <w:insideH w:val="single" w:color="auto" w:sz="6" w:space="0"/>
+            <w:insideV w:val="single" w:color="auto" w:sz="6" w:space="0"/>
+          </w:tblBorders>
+          <w:tblCellMar>
+            <w:top w:w="0" w:type="dxa"/>
+            <w:left w:w="108" w:type="dxa"/>
+            <w:bottom w:w="0" w:type="dxa"/>
+            <w:right w:w="108" w:type="dxa"/>
+          </w:tblCellMar>
+        </w:tblPrEx>
+        <w:trPr>
+          <w:trHeight w:val="936" w:hRule="atLeast"/>
+          <w:jc w:val="center"/>
+        </w:trPr>
+        <w:tc>
+          <w:tcPr>
+            <w:tcW w:w="737" w:type="dxa"/>
+            <w:tcBorders>
+              <w:tl2br w:val="nil"/>
+              <w:tr2bl w:val="nil"/>
+            </w:tcBorders>
+            <w:noWrap w:val="0"/>
+            <w:vAlign w:val="center"/>
+          </w:tcPr>
+          <w:p>
+            <w:pPr>
+              <w:jc w:val="center"/>
+              <w:rPr>
+                <w:rFonts w:hint="default" w:ascii="宋体" w:hAnsi="宋体" w:eastAsia="宋体" w:cs="宋体"/>
+                <w:kern w:val="2"/>
+                <w:sz w:val="21"/>
+                <w:szCs w:val="21"/>
+                <w:lang w:val="en-US" w:eastAsia="zh-CN" w:bidi="ar-SA"/>
+              </w:rPr>
+            </w:pPr>
+            <w:r>
+              <w:rPr>
+                <w:rFonts w:hint="eastAsia" w:ascii="宋体" w:hAnsi="宋体" w:cs="宋体"/>
+                <w:kern w:val="2"/>
+                <w:sz w:val="21"/>
+                <w:szCs w:val="21"/>
+                <w:lang w:val="en-US" w:eastAsia="zh-CN" w:bidi="ar-SA"/>
+              </w:rPr>
+              <w:t>5</w:t>
+            </w:r>
+          </w:p>
+        </w:tc>
+        <w:tc>
+          <w:tcPr>
+            <w:tcW w:w="1701" w:type="dxa"/>
+            <w:tcBorders>
+              <w:tl2br w:val="nil"/>
+              <w:tr2bl w:val="nil"/>
+            </w:tcBorders>
+            <w:noWrap w:val="0"/>
+            <w:vAlign w:val="center"/>
+          </w:tcPr>
+          <w:p>
+            <w:pPr>
+              <w:autoSpaceDE w:val="0"/>
+              <w:autoSpaceDN w:val="0"/>
+              <w:adjustRightInd w:val="0"/>
+              <w:jc w:val="center"/>
+              <w:rPr>
+                <w:rFonts w:hint="eastAsia" w:ascii="宋体" w:hAnsi="宋体" w:eastAsia="宋体" w:cs="宋体"/>
+                <w:kern w:val="2"/>
+                <w:sz w:val="21"/>
+                <w:szCs w:val="21"/>
+                <w:lang w:val="en-US" w:eastAsia="zh-CN" w:bidi="ar-SA"/>
+              </w:rPr>
+            </w:pPr>
+          </w:p>
+        </w:tc>
+        <w:tc>
+          <w:tcPr>
+            <w:tcW w:w="2508" w:type="dxa"/>
+            <w:tcBorders>
+              <w:tl2br w:val="nil"/>
+              <w:tr2bl w:val="nil"/>
+            </w:tcBorders>
+            <w:noWrap w:val="0"/>
+            <w:vAlign w:val="center"/>
+          </w:tcPr>
+          <w:p>
+            <w:pPr>
+              <w:autoSpaceDE w:val="0"/>
+              <w:autoSpaceDN w:val="0"/>
+              <w:adjustRightInd w:val="0"/>
+              <w:jc w:val="center"/>
+              <w:rPr>
+                <w:rFonts w:hint="eastAsia" w:ascii="宋体" w:hAnsi="宋体" w:eastAsia="宋体" w:cs="宋体"/>
+                <w:kern w:val="2"/>
+                <w:sz w:val="21"/>
+                <w:szCs w:val="21"/>
+                <w:lang w:val="en-US" w:eastAsia="zh-CN" w:bidi="ar-SA"/>
+              </w:rPr>
+            </w:pPr>
+          </w:p>
+        </w:tc>
+        <w:tc>
+          <w:tcPr>
+            <w:tcW w:w="1134" w:type="dxa"/>
+            <w:tcBorders>
+              <w:tl2br w:val="nil"/>
+              <w:tr2bl w:val="nil"/>
+            </w:tcBorders>
+            <w:noWrap w:val="0"/>
+            <w:vAlign w:val="center"/>
+          </w:tcPr>
+          <w:p>
+            <w:pPr>
+              <w:autoSpaceDE w:val="0"/>
+              <w:autoSpaceDN w:val="0"/>
+              <w:adjustRightInd w:val="0"/>
+              <w:jc w:val="center"/>
+              <w:rPr>
+                <w:rFonts w:hint="default" w:ascii="宋体" w:hAnsi="宋体" w:eastAsia="宋体" w:cs="宋体"/>
+                <w:kern w:val="2"/>
+                <w:sz w:val="21"/>
+                <w:szCs w:val="21"/>
+                <w:lang w:val="en-US" w:eastAsia="zh-CN" w:bidi="ar-SA"/>
+              </w:rPr>
+            </w:pPr>
+          </w:p>
+        </w:tc>
+        <w:tc>
+          <w:tcPr>
+            <w:tcW w:w="1417" w:type="dxa"/>
+            <w:tcBorders>
+              <w:tl2br w:val="nil"/>
+              <w:tr2bl w:val="nil"/>
+            </w:tcBorders>
+            <w:noWrap w:val="0"/>
+            <w:vAlign w:val="center"/>
+          </w:tcPr>
+          <w:p>
+            <w:pPr>
+              <w:autoSpaceDE w:val="0"/>
+              <w:autoSpaceDN w:val="0"/>
+              <w:adjustRightInd w:val="0"/>
+              <w:jc w:val="center"/>
+              <w:rPr>
+                <w:rFonts w:hint="default" w:ascii="宋体" w:hAnsi="宋体" w:eastAsia="宋体" w:cs="宋体"/>
+                <w:kern w:val="2"/>
+                <w:sz w:val="21"/>
+                <w:szCs w:val="21"/>
+                <w:lang w:val="en-US" w:eastAsia="zh-CN" w:bidi="ar-SA"/>
+              </w:rPr>
+            </w:pPr>
+          </w:p>
+        </w:tc>
+        <w:tc>
+          <w:tcPr>
+            <w:tcW w:w="1417" w:type="dxa"/>
+            <w:tcBorders>
+              <w:tl2br w:val="nil"/>
+              <w:tr2bl w:val="nil"/>
+            </w:tcBorders>
+            <w:noWrap w:val="0"/>
+            <w:vAlign w:val="center"/>
+          </w:tcPr>
+          <w:p>
+            <w:pPr>
+              <w:autoSpaceDE w:val="0"/>
+              <w:autoSpaceDN w:val="0"/>
+              <w:adjustRightInd w:val="0"/>
+              <w:jc w:val="center"/>
+              <w:rPr>
+                <w:rFonts w:hint="default" w:ascii="宋体" w:hAnsi="宋体" w:eastAsia="宋体" w:cs="宋体"/>
+                <w:kern w:val="2"/>
+                <w:sz w:val="21"/>
+                <w:szCs w:val="21"/>
+                <w:lang w:val="en-US" w:eastAsia="zh-CN" w:bidi="ar-SA"/>
+              </w:rPr>
+            </w:pPr>
+          </w:p>
+        </w:tc>
+        <w:tc>
+          <w:tcPr>
+            <w:tcW w:w="1134" w:type="dxa"/>
+            <w:tcBorders>
+              <w:tl2br w:val="nil"/>
+              <w:tr2bl w:val="nil"/>
+            </w:tcBorders>
+            <w:noWrap w:val="0"/>
+            <w:vAlign w:val="center"/>
+          </w:tcPr>
+          <w:p>
+            <w:pPr>
+              <w:jc w:val="center"/>
+              <w:rPr>
+                <w:rFonts w:hint="eastAsia" w:ascii="宋体" w:hAnsi="宋体" w:cs="宋体"/>
+                <w:kern w:val="2"/>
+                <w:sz w:val="21"/>
+                <w:szCs w:val="21"/>
+                <w:lang w:val="en-US" w:eastAsia="zh-CN" w:bidi="ar-SA"/>
+              </w:rPr>
+            </w:pPr>
+          </w:p>
+        </w:tc>
+      </w:tr>
+      <w:tr>
+        <w:tblPrEx>
+          <w:tblBorders>
+            <w:top w:val="single" w:color="auto" w:sz="6" w:space="0"/>
+            <w:left w:val="single" w:color="auto" w:sz="6" w:space="0"/>
+            <w:bottom w:val="single" w:color="auto" w:sz="6" w:space="0"/>
+            <w:right w:val="single" w:color="auto" w:sz="6" w:space="0"/>
+            <w:insideH w:val="single" w:color="auto" w:sz="6" w:space="0"/>
+            <w:insideV w:val="single" w:color="auto" w:sz="6" w:space="0"/>
+          </w:tblBorders>
+          <w:tblCellMar>
+            <w:top w:w="0" w:type="dxa"/>
+            <w:left w:w="108" w:type="dxa"/>
+            <w:bottom w:w="0" w:type="dxa"/>
+            <w:right w:w="108" w:type="dxa"/>
+          </w:tblCellMar>
+        </w:tblPrEx>
+        <w:trPr>
+          <w:trHeight w:val="936" w:hRule="atLeast"/>
+          <w:jc w:val="center"/>
+        </w:trPr>
+        <w:tc>
+          <w:tcPr>
+            <w:tcW w:w="737" w:type="dxa"/>
+            <w:tcBorders>
+              <w:tl2br w:val="nil"/>
+              <w:tr2bl w:val="nil"/>
+            </w:tcBorders>
+            <w:noWrap w:val="0"/>
+            <w:vAlign w:val="center"/>
+          </w:tcPr>
+          <w:p>
+            <w:pPr>
+              <w:jc w:val="center"/>
+              <w:rPr>
+                <w:rFonts w:hint="default" w:ascii="宋体" w:hAnsi="宋体" w:eastAsia="宋体" w:cs="宋体"/>
+                <w:kern w:val="2"/>
+                <w:sz w:val="21"/>
+                <w:szCs w:val="21"/>
+                <w:lang w:val="en-US" w:eastAsia="zh-CN" w:bidi="ar-SA"/>
+              </w:rPr>
+            </w:pPr>
+            <w:r>
+              <w:rPr>
+                <w:rFonts w:hint="eastAsia" w:ascii="宋体" w:hAnsi="宋体" w:cs="宋体"/>
+                <w:kern w:val="2"/>
+                <w:sz w:val="21"/>
+                <w:szCs w:val="21"/>
+                <w:lang w:val="en-US" w:eastAsia="zh-CN" w:bidi="ar-SA"/>
+              </w:rPr>
+              <w:t>6</w:t>
+            </w:r>
+          </w:p>
+        </w:tc>
+        <w:tc>
+          <w:tcPr>
+            <w:tcW w:w="1701" w:type="dxa"/>
+            <w:tcBorders>
+              <w:tl2br w:val="nil"/>
+              <w:tr2bl w:val="nil"/>
+            </w:tcBorders>
+            <w:noWrap w:val="0"/>
+            <w:vAlign w:val="center"/>
+          </w:tcPr>
+          <w:p>
+            <w:pPr>
+              <w:autoSpaceDE w:val="0"/>
+              <w:autoSpaceDN w:val="0"/>
+              <w:adjustRightInd w:val="0"/>
+              <w:jc w:val="center"/>
+              <w:rPr>
+                <w:rFonts w:hint="eastAsia" w:ascii="宋体" w:hAnsi="宋体" w:eastAsia="宋体" w:cs="宋体"/>
+                <w:kern w:val="2"/>
+                <w:sz w:val="21"/>
+                <w:szCs w:val="21"/>
+                <w:lang w:val="en-US" w:eastAsia="zh-CN" w:bidi="ar-SA"/>
+              </w:rPr>
+            </w:pPr>
+          </w:p>
+        </w:tc>
+        <w:tc>
+          <w:tcPr>
+            <w:tcW w:w="2508" w:type="dxa"/>
+            <w:tcBorders>
+              <w:tl2br w:val="nil"/>
+              <w:tr2bl w:val="nil"/>
+            </w:tcBorders>
+            <w:noWrap w:val="0"/>
+            <w:vAlign w:val="center"/>
+          </w:tcPr>
+          <w:p>
+            <w:pPr>
+              <w:autoSpaceDE w:val="0"/>
+              <w:autoSpaceDN w:val="0"/>
+              <w:adjustRightInd w:val="0"/>
+              <w:jc w:val="center"/>
+              <w:rPr>
+                <w:rFonts w:hint="eastAsia" w:ascii="宋体" w:hAnsi="宋体" w:eastAsia="宋体" w:cs="宋体"/>
+                <w:kern w:val="2"/>
+                <w:sz w:val="21"/>
+                <w:szCs w:val="21"/>
+                <w:lang w:val="en-US" w:eastAsia="zh-CN" w:bidi="ar-SA"/>
+              </w:rPr>
+            </w:pPr>
+          </w:p>
+        </w:tc>
+        <w:tc>
+          <w:tcPr>
+            <w:tcW w:w="1134" w:type="dxa"/>
+            <w:tcBorders>
+              <w:tl2br w:val="nil"/>
+              <w:tr2bl w:val="nil"/>
+            </w:tcBorders>
+            <w:noWrap w:val="0"/>
+            <w:vAlign w:val="center"/>
+          </w:tcPr>
+          <w:p>
+            <w:pPr>
+              <w:autoSpaceDE w:val="0"/>
+              <w:autoSpaceDN w:val="0"/>
+              <w:adjustRightInd w:val="0"/>
+              <w:jc w:val="center"/>
+              <w:rPr>
+                <w:rFonts w:hint="default" w:ascii="宋体" w:hAnsi="宋体" w:eastAsia="宋体" w:cs="宋体"/>
+                <w:kern w:val="2"/>
+                <w:sz w:val="21"/>
+                <w:szCs w:val="21"/>
+                <w:lang w:val="en-US" w:eastAsia="zh-CN" w:bidi="ar-SA"/>
+              </w:rPr>
+            </w:pPr>
+          </w:p>
+        </w:tc>
+        <w:tc>
+          <w:tcPr>
+            <w:tcW w:w="1417" w:type="dxa"/>
+            <w:tcBorders>
+              <w:tl2br w:val="nil"/>
+              <w:tr2bl w:val="nil"/>
+            </w:tcBorders>
+            <w:noWrap w:val="0"/>
+            <w:vAlign w:val="center"/>
+          </w:tcPr>
+          <w:p>
+            <w:pPr>
+              <w:autoSpaceDE w:val="0"/>
+              <w:autoSpaceDN w:val="0"/>
+              <w:adjustRightInd w:val="0"/>
+              <w:jc w:val="center"/>
+              <w:rPr>
+                <w:rFonts w:hint="default" w:ascii="宋体" w:hAnsi="宋体" w:eastAsia="宋体" w:cs="宋体"/>
+                <w:kern w:val="2"/>
+                <w:sz w:val="21"/>
+                <w:szCs w:val="21"/>
+                <w:lang w:val="en-US" w:eastAsia="zh-CN" w:bidi="ar-SA"/>
+              </w:rPr>
+            </w:pPr>
+          </w:p>
+        </w:tc>
+        <w:tc>
+          <w:tcPr>
+            <w:tcW w:w="1417" w:type="dxa"/>
+            <w:tcBorders>
+              <w:tl2br w:val="nil"/>
+              <w:tr2bl w:val="nil"/>
+            </w:tcBorders>
+            <w:noWrap w:val="0"/>
+            <w:vAlign w:val="center"/>
+          </w:tcPr>
+          <w:p>
+            <w:pPr>
+              <w:autoSpaceDE w:val="0"/>
+              <w:autoSpaceDN w:val="0"/>
+              <w:adjustRightInd w:val="0"/>
+              <w:jc w:val="center"/>
+              <w:rPr>
+                <w:rFonts w:hint="default" w:ascii="宋体" w:hAnsi="宋体" w:eastAsia="宋体" w:cs="宋体"/>
+                <w:kern w:val="2"/>
+                <w:sz w:val="21"/>
+                <w:szCs w:val="21"/>
+                <w:lang w:val="en-US" w:eastAsia="zh-CN" w:bidi="ar-SA"/>
+              </w:rPr>
+            </w:pPr>
+          </w:p>
+        </w:tc>
+        <w:tc>
+          <w:tcPr>
+            <w:tcW w:w="1134" w:type="dxa"/>
+            <w:tcBorders>
+              <w:tl2br w:val="nil"/>
+              <w:tr2bl w:val="nil"/>
+            </w:tcBorders>
+            <w:noWrap w:val="0"/>
+            <w:vAlign w:val="center"/>
+          </w:tcPr>
+          <w:p>
+            <w:pPr>
+              <w:jc w:val="center"/>
+              <w:rPr>
+                <w:rFonts w:hint="eastAsia" w:ascii="宋体" w:hAnsi="宋体" w:cs="宋体"/>
+                <w:kern w:val="2"/>
+                <w:sz w:val="21"/>
+                <w:szCs w:val="21"/>
+                <w:lang w:val="en-US" w:eastAsia="zh-CN" w:bidi="ar-SA"/>
+              </w:rPr>
+            </w:pPr>
+          </w:p>
+        </w:tc>
+      </w:tr>
+      <w:tr>
+        <w:tblPrEx>
+          <w:tblBorders>
+            <w:top w:val="single" w:color="auto" w:sz="6" w:space="0"/>
+            <w:left w:val="single" w:color="auto" w:sz="6" w:space="0"/>
+            <w:bottom w:val="single" w:color="auto" w:sz="6" w:space="0"/>
+            <w:right w:val="single" w:color="auto" w:sz="6" w:space="0"/>
+            <w:insideH w:val="single" w:color="auto" w:sz="6" w:space="0"/>
+            <w:insideV w:val="single" w:color="auto" w:sz="6" w:space="0"/>
+          </w:tblBorders>
+          <w:tblCellMar>
+            <w:top w:w="0" w:type="dxa"/>
+            <w:left w:w="108" w:type="dxa"/>
+            <w:bottom w:w="0" w:type="dxa"/>
+            <w:right w:w="108" w:type="dxa"/>
+          </w:tblCellMar>
+        </w:tblPrEx>
+        <w:trPr>
+          <w:trHeight w:val="936" w:hRule="atLeast"/>
+          <w:jc w:val="center"/>
+        </w:trPr>
+        <w:tc>
+          <w:tcPr>
+            <w:tcW w:w="737" w:type="dxa"/>
+            <w:tcBorders>
+              <w:tl2br w:val="nil"/>
+              <w:tr2bl w:val="nil"/>
+            </w:tcBorders>
+            <w:noWrap w:val="0"/>
+            <w:vAlign w:val="center"/>
+          </w:tcPr>
+          <w:p>
+            <w:pPr>
+              <w:jc w:val="center"/>
+              <w:rPr>
+                <w:rFonts w:hint="default" w:ascii="宋体" w:hAnsi="宋体" w:eastAsia="宋体" w:cs="宋体"/>
+                <w:kern w:val="2"/>
+                <w:sz w:val="21"/>
+                <w:szCs w:val="21"/>
+                <w:lang w:val="en-US" w:eastAsia="zh-CN" w:bidi="ar-SA"/>
+              </w:rPr>
+            </w:pPr>
+            <w:r>
+              <w:rPr>
+                <w:rFonts w:hint="eastAsia" w:ascii="宋体" w:hAnsi="宋体" w:cs="宋体"/>
+                <w:kern w:val="2"/>
+                <w:sz w:val="21"/>
+                <w:szCs w:val="21"/>
+                <w:lang w:val="en-US" w:eastAsia="zh-CN" w:bidi="ar-SA"/>
+              </w:rPr>
+              <w:t>7</w:t>
+            </w:r>
+          </w:p>
+        </w:tc>
+        <w:tc>
+          <w:tcPr>
+            <w:tcW w:w="1701" w:type="dxa"/>
+            <w:tcBorders>
+              <w:tl2br w:val="nil"/>
+              <w:tr2bl w:val="nil"/>
+            </w:tcBorders>
+            <w:noWrap w:val="0"/>
+            <w:vAlign w:val="center"/>
+          </w:tcPr>
+          <w:p>
+            <w:pPr>
+              <w:autoSpaceDE w:val="0"/>
+              <w:autoSpaceDN w:val="0"/>
+              <w:adjustRightInd w:val="0"/>
+              <w:jc w:val="center"/>
+              <w:rPr>
+                <w:rFonts w:hint="eastAsia" w:ascii="宋体" w:hAnsi="宋体" w:eastAsia="宋体" w:cs="宋体"/>
+                <w:kern w:val="2"/>
+                <w:sz w:val="21"/>
+                <w:szCs w:val="21"/>
+                <w:lang w:val="en-US" w:eastAsia="zh-CN" w:bidi="ar-SA"/>
+              </w:rPr>
+            </w:pPr>
+          </w:p>
+        </w:tc>
+        <w:tc>
+          <w:tcPr>
+            <w:tcW w:w="2508" w:type="dxa"/>
+            <w:tcBorders>
+              <w:tl2br w:val="nil"/>
+              <w:tr2bl w:val="nil"/>
+            </w:tcBorders>
+            <w:noWrap w:val="0"/>
+            <w:vAlign w:val="center"/>
+          </w:tcPr>
+          <w:p>
+            <w:pPr>
+              <w:autoSpaceDE w:val="0"/>
+              <w:autoSpaceDN w:val="0"/>
+              <w:adjustRightInd w:val="0"/>
+              <w:jc w:val="center"/>
+              <w:rPr>
+                <w:rFonts w:hint="eastAsia" w:ascii="宋体" w:hAnsi="宋体" w:eastAsia="宋体" w:cs="宋体"/>
+                <w:kern w:val="2"/>
+                <w:sz w:val="21"/>
+                <w:szCs w:val="21"/>
+                <w:lang w:val="en-US" w:eastAsia="zh-CN" w:bidi="ar-SA"/>
+              </w:rPr>
+            </w:pPr>
+          </w:p>
+        </w:tc>
+        <w:tc>
+          <w:tcPr>
+            <w:tcW w:w="1134" w:type="dxa"/>
+            <w:tcBorders>
+              <w:tl2br w:val="nil"/>
+              <w:tr2bl w:val="nil"/>
+            </w:tcBorders>
+            <w:noWrap w:val="0"/>
+            <w:vAlign w:val="center"/>
+          </w:tcPr>
+          <w:p>
+            <w:pPr>
+              <w:autoSpaceDE w:val="0"/>
+              <w:autoSpaceDN w:val="0"/>
+              <w:adjustRightInd w:val="0"/>
+              <w:jc w:val="center"/>
+              <w:rPr>
+                <w:rFonts w:hint="default" w:ascii="宋体" w:hAnsi="宋体" w:eastAsia="宋体" w:cs="宋体"/>
+                <w:kern w:val="2"/>
+                <w:sz w:val="21"/>
+                <w:szCs w:val="21"/>
+                <w:lang w:val="en-US" w:eastAsia="zh-CN" w:bidi="ar-SA"/>
+              </w:rPr>
+            </w:pPr>
+          </w:p>
+        </w:tc>
+        <w:tc>
+          <w:tcPr>
+            <w:tcW w:w="1417" w:type="dxa"/>
+            <w:tcBorders>
+              <w:tl2br w:val="nil"/>
+              <w:tr2bl w:val="nil"/>
+            </w:tcBorders>
+            <w:noWrap w:val="0"/>
+            <w:vAlign w:val="center"/>
+          </w:tcPr>
+          <w:p>
+            <w:pPr>
+              <w:autoSpaceDE w:val="0"/>
+              <w:autoSpaceDN w:val="0"/>
+              <w:adjustRightInd w:val="0"/>
+              <w:jc w:val="center"/>
+              <w:rPr>
+                <w:rFonts w:hint="default" w:ascii="宋体" w:hAnsi="宋体" w:eastAsia="宋体" w:cs="宋体"/>
+                <w:kern w:val="2"/>
+                <w:sz w:val="21"/>
+                <w:szCs w:val="21"/>
+                <w:lang w:val="en-US" w:eastAsia="zh-CN" w:bidi="ar-SA"/>
+              </w:rPr>
+            </w:pPr>
+          </w:p>
+        </w:tc>
+        <w:tc>
+          <w:tcPr>
+            <w:tcW w:w="1417" w:type="dxa"/>
+            <w:tcBorders>
+              <w:tl2br w:val="nil"/>
+              <w:tr2bl w:val="nil"/>
+            </w:tcBorders>
+            <w:noWrap w:val="0"/>
+            <w:vAlign w:val="center"/>
+          </w:tcPr>
+          <w:p>
+            <w:pPr>
+              <w:autoSpaceDE w:val="0"/>
+              <w:autoSpaceDN w:val="0"/>
+              <w:adjustRightInd w:val="0"/>
+              <w:jc w:val="center"/>
+              <w:rPr>
+                <w:rFonts w:hint="default" w:ascii="宋体" w:hAnsi="宋体" w:eastAsia="宋体" w:cs="宋体"/>
+                <w:kern w:val="2"/>
+                <w:sz w:val="21"/>
+                <w:szCs w:val="21"/>
+                <w:lang w:val="en-US" w:eastAsia="zh-CN" w:bidi="ar-SA"/>
+              </w:rPr>
+            </w:pPr>
+          </w:p>
+        </w:tc>
+        <w:tc>
+          <w:tcPr>
+            <w:tcW w:w="1134" w:type="dxa"/>
+            <w:tcBorders>
+              <w:tl2br w:val="nil"/>
+              <w:tr2bl w:val="nil"/>
+            </w:tcBorders>
+            <w:noWrap w:val="0"/>
+            <w:vAlign w:val="center"/>
+          </w:tcPr>
+          <w:p>
+            <w:pPr>
+              <w:jc w:val="center"/>
+              <w:rPr>
+                <w:rFonts w:hint="eastAsia" w:ascii="宋体" w:hAnsi="宋体" w:cs="宋体"/>
+                <w:kern w:val="2"/>
+                <w:sz w:val="21"/>
+                <w:szCs w:val="21"/>
+                <w:lang w:val="en-US" w:eastAsia="zh-CN" w:bidi="ar-SA"/>
+              </w:rPr>
+            </w:pPr>
+          </w:p>
+        </w:tc>
+      </w:tr>
+      <w:tr>
+        <w:tblPrEx>
+          <w:tblBorders>
+            <w:top w:val="single" w:color="auto" w:sz="6" w:space="0"/>
+            <w:left w:val="single" w:color="auto" w:sz="6" w:space="0"/>
+            <w:bottom w:val="single" w:color="auto" w:sz="6" w:space="0"/>
+            <w:right w:val="single" w:color="auto" w:sz="6" w:space="0"/>
+            <w:insideH w:val="single" w:color="auto" w:sz="6" w:space="0"/>
+            <w:insideV w:val="single" w:color="auto" w:sz="6" w:space="0"/>
+          </w:tblBorders>
+          <w:tblCellMar>
+            <w:top w:w="0" w:type="dxa"/>
+            <w:left w:w="108" w:type="dxa"/>
+            <w:bottom w:w="0" w:type="dxa"/>
+            <w:right w:w="108" w:type="dxa"/>
+          </w:tblCellMar>
+        </w:tblPrEx>
+        <w:trPr>
+          <w:trHeight w:val="936" w:hRule="atLeast"/>
+          <w:jc w:val="center"/>
+        </w:trPr>
+        <w:tc>
+          <w:tcPr>
+            <w:tcW w:w="737" w:type="dxa"/>
+            <w:tcBorders>
+              <w:tl2br w:val="nil"/>
+              <w:tr2bl w:val="nil"/>
+            </w:tcBorders>
+            <w:noWrap w:val="0"/>
+            <w:vAlign w:val="center"/>
+          </w:tcPr>
+          <w:p>
+            <w:pPr>
+              <w:jc w:val="center"/>
+              <w:rPr>
+                <w:rFonts w:hint="default" w:ascii="宋体" w:hAnsi="宋体" w:eastAsia="宋体" w:cs="宋体"/>
+                <w:kern w:val="2"/>
+                <w:sz w:val="21"/>
+                <w:szCs w:val="21"/>
+                <w:lang w:val="en-US" w:eastAsia="zh-CN" w:bidi="ar-SA"/>
+              </w:rPr>
+            </w:pPr>
+            <w:r>
+              <w:rPr>
+                <w:rFonts w:hint="eastAsia" w:ascii="宋体" w:hAnsi="宋体" w:cs="宋体"/>
+                <w:kern w:val="2"/>
+                <w:sz w:val="21"/>
+                <w:szCs w:val="21"/>
+                <w:lang w:val="en-US" w:eastAsia="zh-CN" w:bidi="ar-SA"/>
+              </w:rPr>
+              <w:t>8</w:t>
+            </w:r>
+          </w:p>
+        </w:tc>
+        <w:tc>
+          <w:tcPr>
+            <w:tcW w:w="1701" w:type="dxa"/>
+            <w:tcBorders>
+              <w:tl2br w:val="nil"/>
+              <w:tr2bl w:val="nil"/>
+            </w:tcBorders>
+            <w:noWrap w:val="0"/>
+            <w:vAlign w:val="center"/>
+          </w:tcPr>
+          <w:p>
+            <w:pPr>
+              <w:autoSpaceDE w:val="0"/>
+              <w:autoSpaceDN w:val="0"/>
+              <w:adjustRightInd w:val="0"/>
+              <w:jc w:val="center"/>
+              <w:rPr>
+                <w:rFonts w:hint="eastAsia" w:ascii="宋体" w:hAnsi="宋体" w:eastAsia="宋体" w:cs="宋体"/>
+                <w:kern w:val="2"/>
+                <w:sz w:val="21"/>
+                <w:szCs w:val="21"/>
+                <w:lang w:val="en-US" w:eastAsia="zh-CN" w:bidi="ar-SA"/>
+              </w:rPr>
+            </w:pPr>
+          </w:p>
+        </w:tc>
+        <w:tc>
+          <w:tcPr>
+            <w:tcW w:w="2508" w:type="dxa"/>
+            <w:tcBorders>
+              <w:tl2br w:val="nil"/>
+              <w:tr2bl w:val="nil"/>
+            </w:tcBorders>
+            <w:noWrap w:val="0"/>
+            <w:vAlign w:val="center"/>
+          </w:tcPr>
+          <w:p>
+            <w:pPr>
+              <w:autoSpaceDE w:val="0"/>
+              <w:autoSpaceDN w:val="0"/>
+              <w:adjustRightInd w:val="0"/>
+              <w:jc w:val="center"/>
+              <w:rPr>
+                <w:rFonts w:hint="eastAsia" w:ascii="宋体" w:hAnsi="宋体" w:eastAsia="宋体" w:cs="宋体"/>
+                <w:kern w:val="2"/>
+                <w:sz w:val="21"/>
+                <w:szCs w:val="21"/>
+                <w:lang w:val="en-US" w:eastAsia="zh-CN" w:bidi="ar-SA"/>
+              </w:rPr>
+            </w:pPr>
+          </w:p>
+        </w:tc>
+        <w:tc>
+          <w:tcPr>
+            <w:tcW w:w="1134" w:type="dxa"/>
+            <w:tcBorders>
+              <w:tl2br w:val="nil"/>
+              <w:tr2bl w:val="nil"/>
+            </w:tcBorders>
+            <w:noWrap w:val="0"/>
+            <w:vAlign w:val="center"/>
+          </w:tcPr>
+          <w:p>
+            <w:pPr>
+              <w:autoSpaceDE w:val="0"/>
+              <w:autoSpaceDN w:val="0"/>
+              <w:adjustRightInd w:val="0"/>
+              <w:jc w:val="center"/>
+              <w:rPr>
+                <w:rFonts w:hint="default" w:ascii="宋体" w:hAnsi="宋体" w:eastAsia="宋体" w:cs="宋体"/>
+                <w:kern w:val="2"/>
+                <w:sz w:val="21"/>
+                <w:szCs w:val="21"/>
+                <w:lang w:val="en-US" w:eastAsia="zh-CN" w:bidi="ar-SA"/>
+              </w:rPr>
+            </w:pPr>
+          </w:p>
+        </w:tc>
+        <w:tc>
+          <w:tcPr>
+            <w:tcW w:w="1417" w:type="dxa"/>
+            <w:tcBorders>
+              <w:tl2br w:val="nil"/>
+              <w:tr2bl w:val="nil"/>
+            </w:tcBorders>
+            <w:noWrap w:val="0"/>
+            <w:vAlign w:val="center"/>
+          </w:tcPr>
+          <w:p>
+            <w:pPr>
+              <w:autoSpaceDE w:val="0"/>
+              <w:autoSpaceDN w:val="0"/>
+              <w:adjustRightInd w:val="0"/>
+              <w:jc w:val="center"/>
+              <w:rPr>
+                <w:rFonts w:hint="default" w:ascii="宋体" w:hAnsi="宋体" w:eastAsia="宋体" w:cs="宋体"/>
+                <w:kern w:val="2"/>
+                <w:sz w:val="21"/>
+                <w:szCs w:val="21"/>
+                <w:lang w:val="en-US" w:eastAsia="zh-CN" w:bidi="ar-SA"/>
+              </w:rPr>
+            </w:pPr>
+          </w:p>
+        </w:tc>
+        <w:tc>
+          <w:tcPr>
+            <w:tcW w:w="1417" w:type="dxa"/>
+            <w:tcBorders>
+              <w:tl2br w:val="nil"/>
+              <w:tr2bl w:val="nil"/>
+            </w:tcBorders>
+            <w:noWrap w:val="0"/>
+            <w:vAlign w:val="center"/>
+          </w:tcPr>
+          <w:p>
+            <w:pPr>
+              <w:autoSpaceDE w:val="0"/>
+              <w:autoSpaceDN w:val="0"/>
+              <w:adjustRightInd w:val="0"/>
+              <w:jc w:val="center"/>
+              <w:rPr>
+                <w:rFonts w:hint="default" w:ascii="宋体" w:hAnsi="宋体" w:eastAsia="宋体" w:cs="宋体"/>
+                <w:kern w:val="2"/>
+                <w:sz w:val="21"/>
+                <w:szCs w:val="21"/>
+                <w:lang w:val="en-US" w:eastAsia="zh-CN" w:bidi="ar-SA"/>
+              </w:rPr>
+            </w:pPr>
+          </w:p>
+        </w:tc>
+        <w:tc>
+          <w:tcPr>
+            <w:tcW w:w="1134" w:type="dxa"/>
+            <w:tcBorders>
+              <w:tl2br w:val="nil"/>
+              <w:tr2bl w:val="nil"/>
+            </w:tcBorders>
+            <w:noWrap w:val="0"/>
+            <w:vAlign w:val="center"/>
+          </w:tcPr>
+          <w:p>
+            <w:pPr>
+              <w:jc w:val="center"/>
+              <w:rPr>
+                <w:rFonts w:hint="eastAsia" w:ascii="宋体" w:hAnsi="宋体" w:cs="宋体"/>
+                <w:kern w:val="2"/>
+                <w:sz w:val="21"/>
+                <w:szCs w:val="21"/>
+                <w:lang w:val="en-US" w:eastAsia="zh-CN" w:bidi="ar-SA"/>
+              </w:rPr>
+            </w:pPr>
+          </w:p>
+        </w:tc>
+      </w:tr>
+      <w:tr>
+        <w:tblPrEx>
+          <w:tblBorders>
+            <w:top w:val="single" w:color="auto" w:sz="6" w:space="0"/>
+            <w:left w:val="single" w:color="auto" w:sz="6" w:space="0"/>
+            <w:bottom w:val="single" w:color="auto" w:sz="6" w:space="0"/>
+            <w:right w:val="single" w:color="auto" w:sz="6" w:space="0"/>
+            <w:insideH w:val="single" w:color="auto" w:sz="6" w:space="0"/>
+            <w:insideV w:val="single" w:color="auto" w:sz="6" w:space="0"/>
+          </w:tblBorders>
+          <w:tblCellMar>
+            <w:top w:w="0" w:type="dxa"/>
+            <w:left w:w="108" w:type="dxa"/>
+            <w:bottom w:w="0" w:type="dxa"/>
+            <w:right w:w="108" w:type="dxa"/>
+          </w:tblCellMar>
+        </w:tblPrEx>
+        <w:trPr>
+          <w:trHeight w:val="936" w:hRule="atLeast"/>
+          <w:jc w:val="center"/>
+        </w:trPr>
+        <w:tc>
+          <w:tcPr>
+            <w:tcW w:w="737" w:type="dxa"/>
+            <w:tcBorders>
+              <w:tl2br w:val="nil"/>
+              <w:tr2bl w:val="nil"/>
+            </w:tcBorders>
+            <w:noWrap w:val="0"/>
+            <w:vAlign w:val="center"/>
+          </w:tcPr>
+          <w:p>
+            <w:pPr>
+              <w:jc w:val="center"/>
+              <w:rPr>
+                <w:rFonts w:hint="default" w:ascii="宋体" w:hAnsi="宋体" w:eastAsia="宋体" w:cs="宋体"/>
+                <w:kern w:val="2"/>
+                <w:sz w:val="21"/>
+                <w:szCs w:val="21"/>
+                <w:lang w:val="en-US" w:eastAsia="zh-CN" w:bidi="ar-SA"/>
+              </w:rPr>
+            </w:pPr>
+            <w:r>
+              <w:rPr>
+                <w:rFonts w:hint="eastAsia" w:ascii="宋体" w:hAnsi="宋体" w:cs="宋体"/>
+                <w:kern w:val="2"/>
+                <w:sz w:val="21"/>
+                <w:szCs w:val="21"/>
+                <w:lang w:val="en-US" w:eastAsia="zh-CN" w:bidi="ar-SA"/>
+              </w:rPr>
+              <w:t>9</w:t>
+            </w:r>
+          </w:p>
+        </w:tc>
+        <w:tc>
+          <w:tcPr>
+            <w:tcW w:w="1701" w:type="dxa"/>
+            <w:tcBorders>
+              <w:tl2br w:val="nil"/>
+              <w:tr2bl w:val="nil"/>
+            </w:tcBorders>
+            <w:noWrap w:val="0"/>
+            <w:vAlign w:val="center"/>
+          </w:tcPr>
+          <w:p>
+            <w:pPr>
+              <w:autoSpaceDE w:val="0"/>
+              <w:autoSpaceDN w:val="0"/>
+              <w:adjustRightInd w:val="0"/>
+              <w:jc w:val="center"/>
+              <w:rPr>
+                <w:rFonts w:hint="eastAsia" w:ascii="宋体" w:hAnsi="宋体" w:eastAsia="宋体" w:cs="宋体"/>
+                <w:kern w:val="2"/>
+                <w:sz w:val="21"/>
+                <w:szCs w:val="21"/>
+                <w:lang w:val="en-US" w:eastAsia="zh-CN" w:bidi="ar-SA"/>
+              </w:rPr>
+            </w:pPr>
+          </w:p>
+        </w:tc>
+        <w:tc>
+          <w:tcPr>
+            <w:tcW w:w="2508" w:type="dxa"/>
+            <w:tcBorders>
+              <w:tl2br w:val="nil"/>
+              <w:tr2bl w:val="nil"/>
+            </w:tcBorders>
+            <w:noWrap w:val="0"/>
+            <w:vAlign w:val="center"/>
+          </w:tcPr>
+          <w:p>
+            <w:pPr>
+              <w:autoSpaceDE w:val="0"/>
+              <w:autoSpaceDN w:val="0"/>
+              <w:adjustRightInd w:val="0"/>
+              <w:jc w:val="center"/>
+              <w:rPr>
+                <w:rFonts w:hint="eastAsia" w:ascii="宋体" w:hAnsi="宋体" w:eastAsia="宋体" w:cs="宋体"/>
+                <w:kern w:val="2"/>
+                <w:sz w:val="21"/>
+                <w:szCs w:val="21"/>
+                <w:lang w:val="en-US" w:eastAsia="zh-CN" w:bidi="ar-SA"/>
+              </w:rPr>
+            </w:pPr>
+          </w:p>
+        </w:tc>
+        <w:tc>
+          <w:tcPr>
+            <w:tcW w:w="1134" w:type="dxa"/>
+            <w:tcBorders>
+              <w:tl2br w:val="nil"/>
+              <w:tr2bl w:val="nil"/>
+            </w:tcBorders>
+            <w:noWrap w:val="0"/>
+            <w:vAlign w:val="center"/>
+          </w:tcPr>
+          <w:p>
+            <w:pPr>
+              <w:autoSpaceDE w:val="0"/>
+              <w:autoSpaceDN w:val="0"/>
+              <w:adjustRightInd w:val="0"/>
+              <w:jc w:val="center"/>
+              <w:rPr>
+                <w:rFonts w:hint="default" w:ascii="宋体" w:hAnsi="宋体" w:eastAsia="宋体" w:cs="宋体"/>
+                <w:kern w:val="2"/>
+                <w:sz w:val="21"/>
+                <w:szCs w:val="21"/>
+                <w:lang w:val="en-US" w:eastAsia="zh-CN" w:bidi="ar-SA"/>
+              </w:rPr>
+            </w:pPr>
+          </w:p>
+        </w:tc>
+        <w:tc>
+          <w:tcPr>
+            <w:tcW w:w="1417" w:type="dxa"/>
+            <w:tcBorders>
+              <w:tl2br w:val="nil"/>
+              <w:tr2bl w:val="nil"/>
+            </w:tcBorders>
+            <w:noWrap w:val="0"/>
+            <w:vAlign w:val="center"/>
+          </w:tcPr>
+          <w:p>
+            <w:pPr>
+              <w:autoSpaceDE w:val="0"/>
+              <w:autoSpaceDN w:val="0"/>
+              <w:adjustRightInd w:val="0"/>
+              <w:jc w:val="center"/>
+              <w:rPr>
+                <w:rFonts w:hint="default" w:ascii="宋体" w:hAnsi="宋体" w:eastAsia="宋体" w:cs="宋体"/>
+                <w:kern w:val="2"/>
+                <w:sz w:val="21"/>
+                <w:szCs w:val="21"/>
+                <w:lang w:val="en-US" w:eastAsia="zh-CN" w:bidi="ar-SA"/>
+              </w:rPr>
+            </w:pPr>
+          </w:p>
+        </w:tc>
+        <w:tc>
+          <w:tcPr>
+            <w:tcW w:w="1417" w:type="dxa"/>
+            <w:tcBorders>
+              <w:tl2br w:val="nil"/>
+              <w:tr2bl w:val="nil"/>
+            </w:tcBorders>
+            <w:noWrap w:val="0"/>
+            <w:vAlign w:val="center"/>
+          </w:tcPr>
+          <w:p>
+            <w:pPr>
+              <w:autoSpaceDE w:val="0"/>
+              <w:autoSpaceDN w:val="0"/>
+              <w:adjustRightInd w:val="0"/>
+              <w:jc w:val="center"/>
+              <w:rPr>
+                <w:rFonts w:hint="default" w:ascii="宋体" w:hAnsi="宋体" w:eastAsia="宋体" w:cs="宋体"/>
+                <w:kern w:val="2"/>
+                <w:sz w:val="21"/>
+                <w:szCs w:val="21"/>
+                <w:lang w:val="en-US" w:eastAsia="zh-CN" w:bidi="ar-SA"/>
+              </w:rPr>
+            </w:pPr>
+          </w:p>
+        </w:tc>
+        <w:tc>
+          <w:tcPr>
+            <w:tcW w:w="1134" w:type="dxa"/>
+            <w:tcBorders>
+              <w:tl2br w:val="nil"/>
+              <w:tr2bl w:val="nil"/>
+            </w:tcBorders>
+            <w:noWrap w:val="0"/>
+            <w:vAlign w:val="center"/>
+          </w:tcPr>
+          <w:p>
+            <w:pPr>
+              <w:jc w:val="center"/>
+              <w:rPr>
+                <w:rFonts w:hint="eastAsia" w:ascii="宋体" w:hAnsi="宋体" w:cs="宋体"/>
+                <w:kern w:val="2"/>
+                <w:sz w:val="21"/>
+                <w:szCs w:val="21"/>
+                <w:lang w:val="en-US" w:eastAsia="zh-CN" w:bidi="ar-SA"/>
+              </w:rPr>
+            </w:pPr>
+          </w:p>
+        </w:tc>
+      </w:tr>
+      <w:tr>
+        <w:tblPrEx>
+          <w:tblBorders>
+            <w:top w:val="single" w:color="auto" w:sz="6" w:space="0"/>
+            <w:left w:val="single" w:color="auto" w:sz="6" w:space="0"/>
+            <w:bottom w:val="single" w:color="auto" w:sz="6" w:space="0"/>
+            <w:right w:val="single" w:color="auto" w:sz="6" w:space="0"/>
+            <w:insideH w:val="single" w:color="auto" w:sz="6" w:space="0"/>
+            <w:insideV w:val="single" w:color="auto" w:sz="6" w:space="0"/>
+          </w:tblBorders>
+          <w:tblCellMar>
+            <w:top w:w="0" w:type="dxa"/>
+            <w:left w:w="108" w:type="dxa"/>
+            <w:bottom w:w="0" w:type="dxa"/>
+            <w:right w:w="108" w:type="dxa"/>
+          </w:tblCellMar>
+        </w:tblPrEx>
+        <w:trPr>
+          <w:trHeight w:val="936" w:hRule="atLeast"/>
+          <w:jc w:val="center"/>
+        </w:trPr>
+        <w:tc>
+          <w:tcPr>
+            <w:tcW w:w="737" w:type="dxa"/>
+            <w:tcBorders>
+              <w:tl2br w:val="nil"/>
+              <w:tr2bl w:val="nil"/>
+            </w:tcBorders>
+            <w:noWrap w:val="0"/>
+            <w:vAlign w:val="center"/>
+          </w:tcPr>
+          <w:p>
+            <w:pPr>
+              <w:jc w:val="center"/>
+              <w:rPr>
+                <w:rFonts w:hint="default" w:ascii="宋体" w:hAnsi="宋体" w:eastAsia="宋体" w:cs="宋体"/>
+                <w:kern w:val="2"/>
+                <w:sz w:val="21"/>
+                <w:szCs w:val="21"/>
+                <w:lang w:val="en-US" w:eastAsia="zh-CN" w:bidi="ar-SA"/>
+              </w:rPr>
+            </w:pPr>
+            <w:r>
+              <w:rPr>
+                <w:rFonts w:hint="eastAsia" w:ascii="宋体" w:hAnsi="宋体" w:cs="宋体"/>
+                <w:kern w:val="2"/>
+                <w:sz w:val="21"/>
+                <w:szCs w:val="21"/>
+                <w:lang w:val="en-US" w:eastAsia="zh-CN" w:bidi="ar-SA"/>
+              </w:rPr>
+              <w:t>10</w:t>
+            </w:r>
+          </w:p>
+        </w:tc>
+        <w:tc>
+          <w:tcPr>
+            <w:tcW w:w="1701" w:type="dxa"/>
+            <w:tcBorders>
+              <w:tl2br w:val="nil"/>
+              <w:tr2bl w:val="nil"/>
+            </w:tcBorders>
+            <w:noWrap w:val="0"/>
+            <w:vAlign w:val="center"/>
+          </w:tcPr>
+          <w:p>
+            <w:pPr>
+              <w:autoSpaceDE w:val="0"/>
+              <w:autoSpaceDN w:val="0"/>
+              <w:adjustRightInd w:val="0"/>
+              <w:jc w:val="center"/>
+              <w:rPr>
+                <w:rFonts w:hint="eastAsia" w:ascii="宋体" w:hAnsi="宋体" w:eastAsia="宋体" w:cs="宋体"/>
+                <w:kern w:val="2"/>
+                <w:sz w:val="21"/>
+                <w:szCs w:val="21"/>
+                <w:lang w:val="en-US" w:eastAsia="zh-CN" w:bidi="ar-SA"/>
+              </w:rPr>
+            </w:pPr>
+          </w:p>
+        </w:tc>
+        <w:tc>
+          <w:tcPr>
+            <w:tcW w:w="2508" w:type="dxa"/>
+            <w:tcBorders>
+              <w:tl2br w:val="nil"/>
+              <w:tr2bl w:val="nil"/>
+            </w:tcBorders>
+            <w:noWrap w:val="0"/>
+            <w:vAlign w:val="center"/>
+          </w:tcPr>
+          <w:p>
+            <w:pPr>
+              <w:autoSpaceDE w:val="0"/>
+              <w:autoSpaceDN w:val="0"/>
+              <w:adjustRightInd w:val="0"/>
+              <w:jc w:val="center"/>
+              <w:rPr>
+                <w:rFonts w:hint="eastAsia" w:ascii="宋体" w:hAnsi="宋体" w:eastAsia="宋体" w:cs="宋体"/>
+                <w:kern w:val="2"/>
+                <w:sz w:val="21"/>
+                <w:szCs w:val="21"/>
+                <w:lang w:val="en-US" w:eastAsia="zh-CN" w:bidi="ar-SA"/>
+              </w:rPr>
+            </w:pPr>
+          </w:p>
+        </w:tc>
+        <w:tc>
+          <w:tcPr>
+            <w:tcW w:w="1134" w:type="dxa"/>
+            <w:tcBorders>
+              <w:tl2br w:val="nil"/>
+              <w:tr2bl w:val="nil"/>
+            </w:tcBorders>
+            <w:noWrap w:val="0"/>
+            <w:vAlign w:val="center"/>
+          </w:tcPr>
+          <w:p>
+            <w:pPr>
+              <w:autoSpaceDE w:val="0"/>
+              <w:autoSpaceDN w:val="0"/>
+              <w:adjustRightInd w:val="0"/>
+              <w:jc w:val="center"/>
+              <w:rPr>
+                <w:rFonts w:hint="default" w:ascii="宋体" w:hAnsi="宋体" w:eastAsia="宋体" w:cs="宋体"/>
+                <w:kern w:val="2"/>
+                <w:sz w:val="21"/>
+                <w:szCs w:val="21"/>
+                <w:lang w:val="en-US" w:eastAsia="zh-CN" w:bidi="ar-SA"/>
+              </w:rPr>
+            </w:pPr>
+          </w:p>
+        </w:tc>
+        <w:tc>
+          <w:tcPr>
+            <w:tcW w:w="1417" w:type="dxa"/>
+            <w:tcBorders>
+              <w:tl2br w:val="nil"/>
+              <w:tr2bl w:val="nil"/>
+            </w:tcBorders>
+            <w:noWrap w:val="0"/>
+            <w:vAlign w:val="center"/>
+          </w:tcPr>
+          <w:p>
+            <w:pPr>
+              <w:autoSpaceDE w:val="0"/>
+              <w:autoSpaceDN w:val="0"/>
+              <w:adjustRightInd w:val="0"/>
+              <w:jc w:val="center"/>
+              <w:rPr>
+                <w:rFonts w:hint="default" w:ascii="宋体" w:hAnsi="宋体" w:eastAsia="宋体" w:cs="宋体"/>
+                <w:kern w:val="2"/>
+                <w:sz w:val="21"/>
+                <w:szCs w:val="21"/>
+                <w:lang w:val="en-US" w:eastAsia="zh-CN" w:bidi="ar-SA"/>
+              </w:rPr>
+            </w:pPr>
+          </w:p>
+        </w:tc>
+        <w:tc>
+          <w:tcPr>
+            <w:tcW w:w="1417" w:type="dxa"/>
+            <w:tcBorders>
+              <w:tl2br w:val="nil"/>
+              <w:tr2bl w:val="nil"/>
+            </w:tcBorders>
+            <w:noWrap w:val="0"/>
+            <w:vAlign w:val="center"/>
+          </w:tcPr>
+          <w:p>
+            <w:pPr>
+              <w:autoSpaceDE w:val="0"/>
+              <w:autoSpaceDN w:val="0"/>
+              <w:adjustRightInd w:val="0"/>
+              <w:jc w:val="center"/>
+              <w:rPr>
+                <w:rFonts w:hint="default" w:ascii="宋体" w:hAnsi="宋体" w:eastAsia="宋体" w:cs="宋体"/>
+                <w:kern w:val="2"/>
+                <w:sz w:val="21"/>
+                <w:szCs w:val="21"/>
+                <w:lang w:val="en-US" w:eastAsia="zh-CN" w:bidi="ar-SA"/>
+              </w:rPr>
+            </w:pPr>
+          </w:p>
+        </w:tc>
+        <w:tc>
+          <w:tcPr>
+            <w:tcW w:w="1134" w:type="dxa"/>
+            <w:tcBorders>
+              <w:tl2br w:val="nil"/>
+              <w:tr2bl w:val="nil"/>
+            </w:tcBorders>
+            <w:noWrap w:val="0"/>
+            <w:vAlign w:val="center"/>
+          </w:tcPr>
+          <w:p>
+            <w:pPr>
+              <w:jc w:val="center"/>
+              <w:rPr>
+                <w:rFonts w:hint="eastAsia" w:ascii="宋体" w:hAnsi="宋体" w:cs="宋体"/>
+                <w:kern w:val="2"/>
+                <w:sz w:val="21"/>
+                <w:szCs w:val="21"/>
+                <w:lang w:val="en-US" w:eastAsia="zh-CN" w:bidi="ar-SA"/>
+              </w:rPr>
+            </w:pPr>
+          </w:p>
+        </w:tc>
+      </w:tr>
+      <w:tr>
+        <w:tblPrEx>
+          <w:tblBorders>
+            <w:top w:val="single" w:color="auto" w:sz="6" w:space="0"/>
+            <w:left w:val="single" w:color="auto" w:sz="6" w:space="0"/>
+            <w:bottom w:val="single" w:color="auto" w:sz="6" w:space="0"/>
+            <w:right w:val="single" w:color="auto" w:sz="6" w:space="0"/>
+            <w:insideH w:val="single" w:color="auto" w:sz="6" w:space="0"/>
+            <w:insideV w:val="single" w:color="auto" w:sz="6" w:space="0"/>
+          </w:tblBorders>
+          <w:tblCellMar>
+            <w:top w:w="0" w:type="dxa"/>
+            <w:left w:w="108" w:type="dxa"/>
+            <w:bottom w:w="0" w:type="dxa"/>
+            <w:right w:w="108" w:type="dxa"/>
+          </w:tblCellMar>
+        </w:tblPrEx>
+        <w:trPr>
+          <w:trHeight w:val="936" w:hRule="atLeast"/>
+          <w:jc w:val="center"/>
+        </w:trPr>
+        <w:tc>
+          <w:tcPr>
+            <w:tcW w:w="737" w:type="dxa"/>
+            <w:tcBorders>
+              <w:tl2br w:val="nil"/>
+              <w:tr2bl w:val="nil"/>
+            </w:tcBorders>
+            <w:noWrap w:val="0"/>
+            <w:vAlign w:val="center"/>
+          </w:tcPr>
+          <w:p>
+            <w:pPr>
+              <w:jc w:val="center"/>
+              <w:rPr>
+                <w:rFonts w:hint="default" w:ascii="宋体" w:hAnsi="宋体" w:eastAsia="宋体" w:cs="宋体"/>
+                <w:kern w:val="2"/>
+                <w:sz w:val="21"/>
+                <w:szCs w:val="21"/>
+                <w:lang w:val="en-US" w:eastAsia="zh-CN" w:bidi="ar-SA"/>
+              </w:rPr>
+            </w:pPr>
+            <w:r>
+              <w:rPr>
+                <w:rFonts w:hint="eastAsia" w:ascii="宋体" w:hAnsi="宋体" w:cs="宋体"/>
+                <w:kern w:val="2"/>
+                <w:sz w:val="21"/>
+                <w:szCs w:val="21"/>
+                <w:lang w:val="en-US" w:eastAsia="zh-CN" w:bidi="ar-SA"/>
+              </w:rPr>
+              <w:t>11</w:t>
+            </w:r>
+          </w:p>
+        </w:tc>
+        <w:tc>
+          <w:tcPr>
+            <w:tcW w:w="1701" w:type="dxa"/>
+            <w:tcBorders>
+              <w:tl2br w:val="nil"/>
+              <w:tr2bl w:val="nil"/>
+            </w:tcBorders>
+            <w:noWrap w:val="0"/>
+            <w:vAlign w:val="center"/>
+          </w:tcPr>
+          <w:p>
+            <w:pPr>
+              <w:autoSpaceDE w:val="0"/>
+              <w:autoSpaceDN w:val="0"/>
+              <w:adjustRightInd w:val="0"/>
+              <w:jc w:val="center"/>
+              <w:rPr>
+                <w:rFonts w:hint="eastAsia" w:ascii="宋体" w:hAnsi="宋体" w:eastAsia="宋体" w:cs="宋体"/>
+                <w:kern w:val="2"/>
+                <w:sz w:val="21"/>
+                <w:szCs w:val="21"/>
+                <w:lang w:val="en-US" w:eastAsia="zh-CN" w:bidi="ar-SA"/>
+              </w:rPr>
+            </w:pPr>
+          </w:p>
+        </w:tc>
+        <w:tc>
+          <w:tcPr>
+            <w:tcW w:w="2508" w:type="dxa"/>
+            <w:tcBorders>
+              <w:tl2br w:val="nil"/>
+              <w:tr2bl w:val="nil"/>
+            </w:tcBorders>
+            <w:noWrap w:val="0"/>
+            <w:vAlign w:val="center"/>
+          </w:tcPr>
+          <w:p>
+            <w:pPr>
+              <w:autoSpaceDE w:val="0"/>
+              <w:autoSpaceDN w:val="0"/>
+              <w:adjustRightInd w:val="0"/>
+              <w:jc w:val="center"/>
+              <w:rPr>
+                <w:rFonts w:hint="eastAsia" w:ascii="宋体" w:hAnsi="宋体" w:eastAsia="宋体" w:cs="宋体"/>
+                <w:kern w:val="2"/>
+                <w:sz w:val="21"/>
+                <w:szCs w:val="21"/>
+                <w:lang w:val="en-US" w:eastAsia="zh-CN" w:bidi="ar-SA"/>
+              </w:rPr>
+            </w:pPr>
+          </w:p>
+        </w:tc>
+        <w:tc>
+          <w:tcPr>
+            <w:tcW w:w="1134" w:type="dxa"/>
+            <w:tcBorders>
+              <w:tl2br w:val="nil"/>
+              <w:tr2bl w:val="nil"/>
+            </w:tcBorders>
+            <w:noWrap w:val="0"/>
+            <w:vAlign w:val="center"/>
+          </w:tcPr>
+          <w:p>
+            <w:pPr>
+              <w:autoSpaceDE w:val="0"/>
+              <w:autoSpaceDN w:val="0"/>
+              <w:adjustRightInd w:val="0"/>
+              <w:jc w:val="center"/>
+              <w:rPr>
+                <w:rFonts w:hint="default" w:ascii="宋体" w:hAnsi="宋体" w:eastAsia="宋体" w:cs="宋体"/>
+                <w:kern w:val="2"/>
+                <w:sz w:val="21"/>
+                <w:szCs w:val="21"/>
+                <w:lang w:val="en-US" w:eastAsia="zh-CN" w:bidi="ar-SA"/>
+              </w:rPr>
+            </w:pPr>
+          </w:p>
+        </w:tc>
+        <w:tc>
+          <w:tcPr>
+            <w:tcW w:w="1417" w:type="dxa"/>
+            <w:tcBorders>
+              <w:tl2br w:val="nil"/>
+              <w:tr2bl w:val="nil"/>
+            </w:tcBorders>
+            <w:noWrap w:val="0"/>
+            <w:vAlign w:val="center"/>
+          </w:tcPr>
+          <w:p>
+            <w:pPr>
+              <w:autoSpaceDE w:val="0"/>
+              <w:autoSpaceDN w:val="0"/>
+              <w:adjustRightInd w:val="0"/>
+              <w:jc w:val="center"/>
+              <w:rPr>
+                <w:rFonts w:hint="default" w:ascii="宋体" w:hAnsi="宋体" w:eastAsia="宋体" w:cs="宋体"/>
+                <w:kern w:val="2"/>
+                <w:sz w:val="21"/>
+                <w:szCs w:val="21"/>
+                <w:lang w:val="en-US" w:eastAsia="zh-CN" w:bidi="ar-SA"/>
+              </w:rPr>
+            </w:pPr>
+          </w:p>
+        </w:tc>
+        <w:tc>
+          <w:tcPr>
+            <w:tcW w:w="1417" w:type="dxa"/>
+            <w:tcBorders>
+              <w:tl2br w:val="nil"/>
+              <w:tr2bl w:val="nil"/>
+            </w:tcBorders>
+            <w:noWrap w:val="0"/>
+            <w:vAlign w:val="center"/>
+          </w:tcPr>
+          <w:p>
+            <w:pPr>
+              <w:autoSpaceDE w:val="0"/>
+              <w:autoSpaceDN w:val="0"/>
+              <w:adjustRightInd w:val="0"/>
+              <w:jc w:val="center"/>
+              <w:rPr>
+                <w:rFonts w:hint="default" w:ascii="宋体" w:hAnsi="宋体" w:eastAsia="宋体" w:cs="宋体"/>
+                <w:kern w:val="2"/>
+                <w:sz w:val="21"/>
+                <w:szCs w:val="21"/>
+                <w:lang w:val="en-US" w:eastAsia="zh-CN" w:bidi="ar-SA"/>
+              </w:rPr>
+            </w:pPr>
+          </w:p>
+        </w:tc>
+        <w:tc>
+          <w:tcPr>
+            <w:tcW w:w="1134" w:type="dxa"/>
+            <w:tcBorders>
+              <w:tl2br w:val="nil"/>
+              <w:tr2bl w:val="nil"/>
+            </w:tcBorders>
+            <w:noWrap w:val="0"/>
+            <w:vAlign w:val="center"/>
+          </w:tcPr>
+          <w:p>
+            <w:pPr>
+              <w:jc w:val="center"/>
+              <w:rPr>
+                <w:rFonts w:hint="eastAsia" w:ascii="宋体" w:hAnsi="宋体" w:cs="宋体"/>
+                <w:kern w:val="2"/>
+                <w:sz w:val="21"/>
+                <w:szCs w:val="21"/>
+                <w:lang w:val="en-US" w:eastAsia="zh-CN" w:bidi="ar-SA"/>
+              </w:rPr>
+            </w:pPr>
+          </w:p>
+        </w:tc>
+      </w:tr>
+      <w:tr>
+        <w:tblPrEx>
+          <w:tblBorders>
+            <w:top w:val="single" w:color="auto" w:sz="6" w:space="0"/>
+            <w:left w:val="single" w:color="auto" w:sz="6" w:space="0"/>
+            <w:bottom w:val="single" w:color="auto" w:sz="6" w:space="0"/>
+            <w:right w:val="single" w:color="auto" w:sz="6" w:space="0"/>
+            <w:insideH w:val="single" w:color="auto" w:sz="6" w:space="0"/>
+            <w:insideV w:val="single" w:color="auto" w:sz="6" w:space="0"/>
+          </w:tblBorders>
+          <w:tblCellMar>
+            <w:top w:w="0" w:type="dxa"/>
+            <w:left w:w="108" w:type="dxa"/>
+            <w:bottom w:w="0" w:type="dxa"/>
+            <w:right w:w="108" w:type="dxa"/>
+          </w:tblCellMar>
+        </w:tblPrEx>
+        <w:trPr>
+          <w:trHeight w:val="936" w:hRule="atLeast"/>
+          <w:jc w:val="center"/>
+        </w:trPr>
+        <w:tc>
+          <w:tcPr>
+            <w:tcW w:w="737" w:type="dxa"/>
+            <w:tcBorders>
+              <w:tl2br w:val="nil"/>
+              <w:tr2bl w:val="nil"/>
+            </w:tcBorders>
+            <w:noWrap w:val="0"/>
+            <w:vAlign w:val="center"/>
+          </w:tcPr>
+          <w:p>
+            <w:pPr>
+              <w:jc w:val="center"/>
+              <w:rPr>
+                <w:rFonts w:hint="default" w:ascii="宋体" w:hAnsi="宋体" w:eastAsia="宋体" w:cs="宋体"/>
+                <w:kern w:val="2"/>
+                <w:sz w:val="21"/>
+                <w:szCs w:val="21"/>
+                <w:lang w:val="en-US" w:eastAsia="zh-CN" w:bidi="ar-SA"/>
+              </w:rPr>
+            </w:pPr>
+            <w:r>
+              <w:rPr>
+                <w:rFonts w:hint="eastAsia" w:ascii="宋体" w:hAnsi="宋体" w:cs="宋体"/>
+                <w:kern w:val="2"/>
+                <w:sz w:val="21"/>
+                <w:szCs w:val="21"/>
+                <w:lang w:val="en-US" w:eastAsia="zh-CN" w:bidi="ar-SA"/>
+              </w:rPr>
+              <w:t>12</w:t>
+            </w:r>
+          </w:p>
+        </w:tc>
+        <w:tc>
+          <w:tcPr>
+            <w:tcW w:w="1701" w:type="dxa"/>
+            <w:tcBorders>
+              <w:tl2br w:val="nil"/>
+              <w:tr2bl w:val="nil"/>
+            </w:tcBorders>
+            <w:noWrap w:val="0"/>
+            <w:vAlign w:val="center"/>
+          </w:tcPr>
+          <w:p>
+            <w:pPr>
+              <w:autoSpaceDE w:val="0"/>
+              <w:autoSpaceDN w:val="0"/>
+              <w:adjustRightInd w:val="0"/>
+              <w:jc w:val="center"/>
+              <w:rPr>
+                <w:rFonts w:hint="eastAsia" w:ascii="宋体" w:hAnsi="宋体" w:eastAsia="宋体" w:cs="宋体"/>
+                <w:kern w:val="2"/>
+                <w:sz w:val="21"/>
+                <w:szCs w:val="21"/>
+                <w:lang w:val="en-US" w:eastAsia="zh-CN" w:bidi="ar-SA"/>
+              </w:rPr>
+            </w:pPr>
+          </w:p>
+        </w:tc>
+        <w:tc>
+          <w:tcPr>
+            <w:tcW w:w="2508" w:type="dxa"/>
+            <w:tcBorders>
+              <w:tl2br w:val="nil"/>
+              <w:tr2bl w:val="nil"/>
+            </w:tcBorders>
+            <w:noWrap w:val="0"/>
+            <w:vAlign w:val="center"/>
+          </w:tcPr>
+          <w:p>
+            <w:pPr>
+              <w:autoSpaceDE w:val="0"/>
+              <w:autoSpaceDN w:val="0"/>
+              <w:adjustRightInd w:val="0"/>
+              <w:jc w:val="center"/>
+              <w:rPr>
+                <w:rFonts w:hint="eastAsia" w:ascii="宋体" w:hAnsi="宋体" w:eastAsia="宋体" w:cs="宋体"/>
+                <w:kern w:val="2"/>
+                <w:sz w:val="21"/>
+                <w:szCs w:val="21"/>
+                <w:lang w:val="en-US" w:eastAsia="zh-CN" w:bidi="ar-SA"/>
+              </w:rPr>
+            </w:pPr>
+          </w:p>
+        </w:tc>
+        <w:tc>
+          <w:tcPr>
+            <w:tcW w:w="1134" w:type="dxa"/>
+            <w:tcBorders>
+              <w:tl2br w:val="nil"/>
+              <w:tr2bl w:val="nil"/>
+            </w:tcBorders>
+            <w:noWrap w:val="0"/>
+            <w:vAlign w:val="center"/>
+          </w:tcPr>
+          <w:p>
+            <w:pPr>
+              <w:autoSpaceDE w:val="0"/>
+              <w:autoSpaceDN w:val="0"/>
+              <w:adjustRightInd w:val="0"/>
+              <w:jc w:val="center"/>
+              <w:rPr>
+                <w:rFonts w:hint="default" w:ascii="宋体" w:hAnsi="宋体" w:eastAsia="宋体" w:cs="宋体"/>
+                <w:kern w:val="2"/>
+                <w:sz w:val="21"/>
+                <w:szCs w:val="21"/>
+                <w:lang w:val="en-US" w:eastAsia="zh-CN" w:bidi="ar-SA"/>
+              </w:rPr>
+            </w:pPr>
+          </w:p>
+        </w:tc>
+        <w:tc>
+          <w:tcPr>
+            <w:tcW w:w="1417" w:type="dxa"/>
+            <w:tcBorders>
+              <w:tl2br w:val="nil"/>
+              <w:tr2bl w:val="nil"/>
+            </w:tcBorders>
+            <w:noWrap w:val="0"/>
+            <w:vAlign w:val="center"/>
+          </w:tcPr>
+          <w:p>
+            <w:pPr>
+              <w:autoSpaceDE w:val="0"/>
+              <w:autoSpaceDN w:val="0"/>
+              <w:adjustRightInd w:val="0"/>
+              <w:jc w:val="center"/>
+              <w:rPr>
+                <w:rFonts w:hint="default" w:ascii="宋体" w:hAnsi="宋体" w:eastAsia="宋体" w:cs="宋体"/>
+                <w:kern w:val="2"/>
+                <w:sz w:val="21"/>
+                <w:szCs w:val="21"/>
+                <w:lang w:val="en-US" w:eastAsia="zh-CN" w:bidi="ar-SA"/>
+              </w:rPr>
+            </w:pPr>
+          </w:p>
+        </w:tc>
+        <w:tc>
+          <w:tcPr>
+            <w:tcW w:w="1417" w:type="dxa"/>
+            <w:tcBorders>
+              <w:tl2br w:val="nil"/>
+              <w:tr2bl w:val="nil"/>
+            </w:tcBorders>
+            <w:noWrap w:val="0"/>
+            <w:vAlign w:val="center"/>
+          </w:tcPr>
+          <w:p>
+            <w:pPr>
+              <w:autoSpaceDE w:val="0"/>
+              <w:autoSpaceDN w:val="0"/>
+              <w:adjustRightInd w:val="0"/>
+              <w:jc w:val="center"/>
+              <w:rPr>
+                <w:rFonts w:hint="default" w:ascii="宋体" w:hAnsi="宋体" w:eastAsia="宋体" w:cs="宋体"/>
+                <w:kern w:val="2"/>
+                <w:sz w:val="21"/>
+                <w:szCs w:val="21"/>
+                <w:lang w:val="en-US" w:eastAsia="zh-CN" w:bidi="ar-SA"/>
+              </w:rPr>
+            </w:pPr>
+          </w:p>
+        </w:tc>
+        <w:tc>
+          <w:tcPr>
+            <w:tcW w:w="1134" w:type="dxa"/>
+            <w:tcBorders>
+              <w:tl2br w:val="nil"/>
+              <w:tr2bl w:val="nil"/>
+            </w:tcBorders>
+            <w:noWrap w:val="0"/>
+            <w:vAlign w:val="center"/>
+          </w:tcPr>
+          <w:p>
+            <w:pPr>
+              <w:jc w:val="center"/>
+              <w:rPr>
+                <w:rFonts w:hint="eastAsia" w:ascii="宋体" w:hAnsi="宋体" w:cs="宋体"/>
+                <w:kern w:val="2"/>
+                <w:sz w:val="21"/>
+                <w:szCs w:val="21"/>
+                <w:lang w:val="en-US" w:eastAsia="zh-CN" w:bidi="ar-SA"/>
+              </w:rPr>
+            </w:pPr>
+          </w:p>
+        </w:tc>
+      </w:tr>
+      <w:tr>
+        <w:tblPrEx>
+          <w:tblBorders>
+            <w:top w:val="single" w:color="auto" w:sz="6" w:space="0"/>
+            <w:left w:val="single" w:color="auto" w:sz="6" w:space="0"/>
+            <w:bottom w:val="single" w:color="auto" w:sz="6" w:space="0"/>
+            <w:right w:val="single" w:color="auto" w:sz="6" w:space="0"/>
+            <w:insideH w:val="single" w:color="auto" w:sz="6" w:space="0"/>
+            <w:insideV w:val="single" w:color="auto" w:sz="6" w:space="0"/>
+          </w:tblBorders>
+          <w:tblCellMar>
+            <w:top w:w="0" w:type="dxa"/>
+            <w:left w:w="108" w:type="dxa"/>
+            <w:bottom w:w="0" w:type="dxa"/>
+            <w:right w:w="108" w:type="dxa"/>
+          </w:tblCellMar>
+        </w:tblPrEx>
+        <w:trPr>
+          <w:trHeight w:val="936" w:hRule="atLeast"/>
+          <w:jc w:val="center"/>
+        </w:trPr>
+        <w:tc>
+          <w:tcPr>
+            <w:tcW w:w="737" w:type="dxa"/>
+            <w:tcBorders>
+              <w:tl2br w:val="nil"/>
+              <w:tr2bl w:val="nil"/>
+            </w:tcBorders>
+            <w:noWrap w:val="0"/>
+            <w:vAlign w:val="center"/>
+          </w:tcPr>
+          <w:p>
+            <w:pPr>
+              <w:jc w:val="center"/>
+              <w:rPr>
+                <w:rFonts w:hint="default" w:ascii="宋体" w:hAnsi="宋体" w:eastAsia="宋体" w:cs="宋体"/>
+                <w:kern w:val="2"/>
+                <w:sz w:val="21"/>
+                <w:szCs w:val="21"/>
+                <w:lang w:val="en-US" w:eastAsia="zh-CN" w:bidi="ar-SA"/>
+              </w:rPr>
+            </w:pPr>
+            <w:r>
+              <w:rPr>
+                <w:rFonts w:hint="eastAsia" w:ascii="宋体" w:hAnsi="宋体" w:cs="宋体"/>
+                <w:kern w:val="2"/>
+                <w:sz w:val="21"/>
+                <w:szCs w:val="21"/>
+                <w:lang w:val="en-US" w:eastAsia="zh-CN" w:bidi="ar-SA"/>
+              </w:rPr>
+              <w:t>13</w:t>
+            </w:r>
+          </w:p>
+        </w:tc>
+        <w:tc>
+          <w:tcPr>
+            <w:tcW w:w="1701" w:type="dxa"/>
+            <w:tcBorders>
+              <w:tl2br w:val="nil"/>
+              <w:tr2bl w:val="nil"/>
+            </w:tcBorders>
+            <w:noWrap w:val="0"/>
+            <w:vAlign w:val="center"/>
+          </w:tcPr>
+          <w:p>
+            <w:pPr>
+              <w:autoSpaceDE w:val="0"/>
+              <w:autoSpaceDN w:val="0"/>
+              <w:adjustRightInd w:val="0"/>
+              <w:jc w:val="center"/>
+              <w:rPr>
+                <w:rFonts w:hint="eastAsia" w:ascii="宋体" w:hAnsi="宋体" w:eastAsia="宋体" w:cs="宋体"/>
+                <w:kern w:val="2"/>
+                <w:sz w:val="21"/>
+                <w:szCs w:val="21"/>
+                <w:lang w:val="en-US" w:eastAsia="zh-CN" w:bidi="ar-SA"/>
+              </w:rPr>
+            </w:pPr>
+          </w:p>
+        </w:tc>
+        <w:tc>
+          <w:tcPr>
+            <w:tcW w:w="2508" w:type="dxa"/>
+            <w:tcBorders>
+              <w:tl2br w:val="nil"/>
+              <w:tr2bl w:val="nil"/>
+            </w:tcBorders>
+            <w:noWrap w:val="0"/>
+            <w:vAlign w:val="center"/>
+          </w:tcPr>
+          <w:p>
+            <w:pPr>
+              <w:autoSpaceDE w:val="0"/>
+              <w:autoSpaceDN w:val="0"/>
+              <w:adjustRightInd w:val="0"/>
+              <w:jc w:val="center"/>
+              <w:rPr>
+                <w:rFonts w:hint="eastAsia" w:ascii="宋体" w:hAnsi="宋体" w:eastAsia="宋体" w:cs="宋体"/>
+                <w:kern w:val="2"/>
+                <w:sz w:val="21"/>
+                <w:szCs w:val="21"/>
+                <w:lang w:val="en-US" w:eastAsia="zh-CN" w:bidi="ar-SA"/>
+              </w:rPr>
+            </w:pPr>
+          </w:p>
+        </w:tc>
+        <w:tc>
+          <w:tcPr>
+            <w:tcW w:w="1134" w:type="dxa"/>
+            <w:tcBorders>
+              <w:tl2br w:val="nil"/>
+              <w:tr2bl w:val="nil"/>
+            </w:tcBorders>
+            <w:noWrap w:val="0"/>
+            <w:vAlign w:val="center"/>
+          </w:tcPr>
+          <w:p>
+            <w:pPr>
+              <w:autoSpaceDE w:val="0"/>
+              <w:autoSpaceDN w:val="0"/>
+              <w:adjustRightInd w:val="0"/>
+              <w:jc w:val="center"/>
+              <w:rPr>
+                <w:rFonts w:hint="default" w:ascii="宋体" w:hAnsi="宋体" w:eastAsia="宋体" w:cs="宋体"/>
+                <w:kern w:val="2"/>
+                <w:sz w:val="21"/>
+                <w:szCs w:val="21"/>
+                <w:lang w:val="en-US" w:eastAsia="zh-CN" w:bidi="ar-SA"/>
+              </w:rPr>
+            </w:pPr>
+          </w:p>
+        </w:tc>
+        <w:tc>
+          <w:tcPr>
+            <w:tcW w:w="1417" w:type="dxa"/>
+            <w:tcBorders>
+              <w:tl2br w:val="nil"/>
+              <w:tr2bl w:val="nil"/>
+            </w:tcBorders>
+            <w:noWrap w:val="0"/>
+            <w:vAlign w:val="center"/>
+          </w:tcPr>
+          <w:p>
+            <w:pPr>
+              <w:autoSpaceDE w:val="0"/>
+              <w:autoSpaceDN w:val="0"/>
+              <w:adjustRightInd w:val="0"/>
+              <w:jc w:val="center"/>
+              <w:rPr>
+                <w:rFonts w:hint="default" w:ascii="宋体" w:hAnsi="宋体" w:eastAsia="宋体" w:cs="宋体"/>
+                <w:kern w:val="2"/>
+                <w:sz w:val="21"/>
+                <w:szCs w:val="21"/>
+                <w:lang w:val="en-US" w:eastAsia="zh-CN" w:bidi="ar-SA"/>
+              </w:rPr>
+            </w:pPr>
+          </w:p>
+        </w:tc>
+        <w:tc>
+          <w:tcPr>
+            <w:tcW w:w="1417" w:type="dxa"/>
+            <w:tcBorders>
+              <w:tl2br w:val="nil"/>
+              <w:tr2bl w:val="nil"/>
+            </w:tcBorders>
+            <w:noWrap w:val="0"/>
+            <w:vAlign w:val="center"/>
+          </w:tcPr>
+          <w:p>
+            <w:pPr>
+              <w:autoSpaceDE w:val="0"/>
+              <w:autoSpaceDN w:val="0"/>
+              <w:adjustRightInd w:val="0"/>
+              <w:jc w:val="center"/>
+              <w:rPr>
+                <w:rFonts w:hint="default" w:ascii="宋体" w:hAnsi="宋体" w:eastAsia="宋体" w:cs="宋体"/>
+                <w:kern w:val="2"/>
+                <w:sz w:val="21"/>
+                <w:szCs w:val="21"/>
+                <w:lang w:val="en-US" w:eastAsia="zh-CN" w:bidi="ar-SA"/>
+              </w:rPr>
+            </w:pPr>
+          </w:p>
+        </w:tc>
+        <w:tc>
+          <w:tcPr>
+            <w:tcW w:w="1134" w:type="dxa"/>
+            <w:tcBorders>
+              <w:tl2br w:val="nil"/>
+              <w:tr2bl w:val="nil"/>
+            </w:tcBorders>
+            <w:noWrap w:val="0"/>
+            <w:vAlign w:val="center"/>
+          </w:tcPr>
+          <w:p>
+            <w:pPr>
+              <w:jc w:val="center"/>
+              <w:rPr>
+                <w:rFonts w:hint="eastAsia" w:ascii="宋体" w:hAnsi="宋体" w:cs="宋体"/>
+                <w:kern w:val="2"/>
+                <w:sz w:val="21"/>
+                <w:szCs w:val="21"/>
+                <w:lang w:val="en-US" w:eastAsia="zh-CN" w:bidi="ar-SA"/>
+              </w:rPr>
+            </w:pPr>
+          </w:p>
+        </w:tc>
+      </w:tr>
+    </w:tbl>
     <w:p>
       <w:pPr>
         <w:pStyle w:val="9"/>

</xml_diff>